<commit_message>
Update CV contact and restore CV history
</commit_message>
<xml_diff>
--- a/assets/Yuxuan_Ni_CV.docx
+++ b/assets/Yuxuan_Ni_CV.docx
@@ -4,14 +4,15 @@
   <w:body>
     <w:p>
       <w:pPr>
-        <w:spacing w:after="20"/>
+        <w:spacing w:after="0"/>
         <w:jc w:val="center"/>
       </w:pPr>
       <w:r>
         <w:rPr>
-          <w:rFonts w:ascii="Times New Roman" w:hAnsi="Times New Roman"/>
           <w:b/>
-          <w:sz w:val="33"/>
+          <w:i w:val="0"/>
+          <w:color w:val="1D2524"/>
+          <w:sz w:val="32"/>
         </w:rPr>
         <w:t>Yuxuan Ni</w:t>
       </w:r>
@@ -23,9 +24,10 @@
       </w:pPr>
       <w:r>
         <w:rPr>
-          <w:rFonts w:ascii="Times New Roman" w:hAnsi="Times New Roman"/>
-          <w:color w:val="333333"/>
-          <w:sz w:val="15"/>
+          <w:b w:val="0"/>
+          <w:i w:val="0"/>
+          <w:color w:val="5D6864"/>
+          <w:sz w:val="17"/>
         </w:rPr>
         <w:t>(412) 618-9972 | yni5@crimson.ua.edu | github.com/YuxuanNi-25 | yuxuanni-25.github.io</w:t>
       </w:r>
@@ -33,16 +35,13 @@
     <w:p>
       <w:pPr>
         <w:keepNext/>
-        <w:spacing w:before="60" w:after="20"/>
-        <w:pBdr>
-          <w:bottom w:val="single" w:sz="5" w:space="1" w:color="7A8CA3"/>
-        </w:pBdr>
+        <w:spacing w:before="120" w:after="40"/>
       </w:pPr>
       <w:r>
         <w:rPr>
-          <w:rFonts w:ascii="Times New Roman" w:hAnsi="Times New Roman"/>
           <w:b/>
-          <w:color w:val="1F4D78"/>
+          <w:i w:val="0"/>
+          <w:color w:val="1F4F4C"/>
           <w:sz w:val="20"/>
         </w:rPr>
         <w:t>EDUCATION</w:t>
@@ -50,37 +49,35 @@
     </w:p>
     <w:tbl>
       <w:tblPr>
-        <w:tblW w:type="dxa" w:w="10800"/>
+        <w:tblW w:type="auto" w:w="0"/>
         <w:tblLayout w:type="fixed"/>
         <w:tblLook w:firstColumn="1" w:firstRow="1" w:lastColumn="0" w:lastRow="0" w:noHBand="0" w:noVBand="1" w:val="04A0"/>
       </w:tblPr>
       <w:tblGrid>
-        <w:gridCol w:w="8640"/>
-        <w:gridCol w:w="2160"/>
+        <w:gridCol w:w="5328"/>
+        <w:gridCol w:w="5328"/>
       </w:tblGrid>
       <w:tr>
         <w:tc>
           <w:tcPr>
-            <w:tcW w:type="dxa" w:w="8640"/>
+            <w:tcW w:type="dxa" w:w="7704"/>
             <w:vAlign w:val="center"/>
-            <w:tcMar>
-              <w:top w:w="0" w:type="dxa"/>
-              <w:start w:w="0" w:type="dxa"/>
-              <w:bottom w:w="0" w:type="dxa"/>
-              <w:end w:w="0" w:type="dxa"/>
-            </w:tcMar>
+            <w:tcBorders>
+              <w:top w:val="nil"/>
+              <w:left w:val="nil"/>
+              <w:bottom w:val="nil"/>
+              <w:right w:val="nil"/>
+            </w:tcBorders>
           </w:tcPr>
           <w:p>
             <w:pPr>
-              <w:keepNext/>
-              <w:spacing w:before="0" w:after="0"/>
+              <w:spacing w:after="0"/>
             </w:pPr>
             <w:r>
               <w:rPr>
-                <w:rFonts w:ascii="Times New Roman" w:hAnsi="Times New Roman"/>
                 <w:b/>
-                <w:color w:val="111111"/>
-                <w:sz w:val="16"/>
+                <w:i w:val="0"/>
+                <w:sz w:val="18"/>
               </w:rPr>
               <w:t>The University of Alabama</w:t>
             </w:r>
@@ -88,26 +85,25 @@
         </w:tc>
         <w:tc>
           <w:tcPr>
-            <w:tcW w:type="dxa" w:w="2160"/>
+            <w:tcW w:type="dxa" w:w="2232"/>
             <w:vAlign w:val="center"/>
-            <w:tcMar>
-              <w:top w:w="0" w:type="dxa"/>
-              <w:start w:w="0" w:type="dxa"/>
-              <w:bottom w:w="0" w:type="dxa"/>
-              <w:end w:w="0" w:type="dxa"/>
-            </w:tcMar>
+            <w:tcBorders>
+              <w:top w:val="nil"/>
+              <w:left w:val="nil"/>
+              <w:bottom w:val="nil"/>
+              <w:right w:val="nil"/>
+            </w:tcBorders>
           </w:tcPr>
           <w:p>
             <w:pPr>
-              <w:keepNext/>
-              <w:spacing w:before="0" w:after="0"/>
+              <w:spacing w:after="0"/>
               <w:jc w:val="right"/>
             </w:pPr>
             <w:r>
               <w:rPr>
-                <w:rFonts w:ascii="Times New Roman" w:hAnsi="Times New Roman"/>
-                <w:color w:val="111111"/>
-                <w:sz w:val="15"/>
+                <w:b/>
+                <w:i w:val="0"/>
+                <w:sz w:val="18"/>
               </w:rPr>
               <w:t>Sep 2025 - Present</w:t>
             </w:r>
@@ -117,52 +113,48 @@
     </w:tbl>
     <w:p>
       <w:pPr>
-        <w:keepNext w:val="0"/>
-        <w:spacing w:after="0"/>
+        <w:spacing w:after="20"/>
       </w:pPr>
       <w:r>
         <w:rPr>
-          <w:rFonts w:ascii="Times New Roman" w:hAnsi="Times New Roman"/>
-          <w:i/>
-          <w:color w:val="333333"/>
-          <w:sz w:val="15"/>
+          <w:b w:val="0"/>
+          <w:i w:val="0"/>
+          <w:sz w:val="17"/>
         </w:rPr>
         <w:t>Ph.D., Electrical and Computer Engineering | Tuscaloosa, AL</w:t>
       </w:r>
     </w:p>
     <w:tbl>
       <w:tblPr>
-        <w:tblW w:type="dxa" w:w="10800"/>
+        <w:tblW w:type="auto" w:w="0"/>
         <w:tblLayout w:type="fixed"/>
         <w:tblLook w:firstColumn="1" w:firstRow="1" w:lastColumn="0" w:lastRow="0" w:noHBand="0" w:noVBand="1" w:val="04A0"/>
       </w:tblPr>
       <w:tblGrid>
-        <w:gridCol w:w="8640"/>
-        <w:gridCol w:w="2160"/>
+        <w:gridCol w:w="5328"/>
+        <w:gridCol w:w="5328"/>
       </w:tblGrid>
       <w:tr>
         <w:tc>
           <w:tcPr>
-            <w:tcW w:type="dxa" w:w="8640"/>
+            <w:tcW w:type="dxa" w:w="7704"/>
             <w:vAlign w:val="center"/>
-            <w:tcMar>
-              <w:top w:w="0" w:type="dxa"/>
-              <w:start w:w="0" w:type="dxa"/>
-              <w:bottom w:w="0" w:type="dxa"/>
-              <w:end w:w="0" w:type="dxa"/>
-            </w:tcMar>
+            <w:tcBorders>
+              <w:top w:val="nil"/>
+              <w:left w:val="nil"/>
+              <w:bottom w:val="nil"/>
+              <w:right w:val="nil"/>
+            </w:tcBorders>
           </w:tcPr>
           <w:p>
             <w:pPr>
-              <w:keepNext/>
-              <w:spacing w:before="0" w:after="0"/>
+              <w:spacing w:after="0"/>
             </w:pPr>
             <w:r>
               <w:rPr>
-                <w:rFonts w:ascii="Times New Roman" w:hAnsi="Times New Roman"/>
                 <w:b/>
-                <w:color w:val="111111"/>
-                <w:sz w:val="16"/>
+                <w:i w:val="0"/>
+                <w:sz w:val="18"/>
               </w:rPr>
               <w:t>Carnegie Mellon University</w:t>
             </w:r>
@@ -170,26 +162,25 @@
         </w:tc>
         <w:tc>
           <w:tcPr>
-            <w:tcW w:type="dxa" w:w="2160"/>
+            <w:tcW w:type="dxa" w:w="2232"/>
             <w:vAlign w:val="center"/>
-            <w:tcMar>
-              <w:top w:w="0" w:type="dxa"/>
-              <w:start w:w="0" w:type="dxa"/>
-              <w:bottom w:w="0" w:type="dxa"/>
-              <w:end w:w="0" w:type="dxa"/>
-            </w:tcMar>
+            <w:tcBorders>
+              <w:top w:val="nil"/>
+              <w:left w:val="nil"/>
+              <w:bottom w:val="nil"/>
+              <w:right w:val="nil"/>
+            </w:tcBorders>
           </w:tcPr>
           <w:p>
             <w:pPr>
-              <w:keepNext/>
-              <w:spacing w:before="0" w:after="0"/>
+              <w:spacing w:after="0"/>
               <w:jc w:val="right"/>
             </w:pPr>
             <w:r>
               <w:rPr>
-                <w:rFonts w:ascii="Times New Roman" w:hAnsi="Times New Roman"/>
-                <w:color w:val="111111"/>
-                <w:sz w:val="15"/>
+                <w:b/>
+                <w:i w:val="0"/>
+                <w:sz w:val="18"/>
               </w:rPr>
               <w:t>Jan 2023 - Dec 2023</w:t>
             </w:r>
@@ -199,52 +190,48 @@
     </w:tbl>
     <w:p>
       <w:pPr>
-        <w:keepNext w:val="0"/>
-        <w:spacing w:after="0"/>
+        <w:spacing w:after="20"/>
       </w:pPr>
       <w:r>
         <w:rPr>
-          <w:rFonts w:ascii="Times New Roman" w:hAnsi="Times New Roman"/>
-          <w:i/>
-          <w:color w:val="333333"/>
-          <w:sz w:val="15"/>
+          <w:b w:val="0"/>
+          <w:i w:val="0"/>
+          <w:sz w:val="17"/>
         </w:rPr>
         <w:t>M.S. in Engineering &amp; Technology Innovation Management | Pittsburgh, PA</w:t>
       </w:r>
     </w:p>
     <w:tbl>
       <w:tblPr>
-        <w:tblW w:type="dxa" w:w="10800"/>
+        <w:tblW w:type="auto" w:w="0"/>
         <w:tblLayout w:type="fixed"/>
         <w:tblLook w:firstColumn="1" w:firstRow="1" w:lastColumn="0" w:lastRow="0" w:noHBand="0" w:noVBand="1" w:val="04A0"/>
       </w:tblPr>
       <w:tblGrid>
-        <w:gridCol w:w="8640"/>
-        <w:gridCol w:w="2160"/>
+        <w:gridCol w:w="5328"/>
+        <w:gridCol w:w="5328"/>
       </w:tblGrid>
       <w:tr>
         <w:tc>
           <w:tcPr>
-            <w:tcW w:type="dxa" w:w="8640"/>
+            <w:tcW w:type="dxa" w:w="7704"/>
             <w:vAlign w:val="center"/>
-            <w:tcMar>
-              <w:top w:w="0" w:type="dxa"/>
-              <w:start w:w="0" w:type="dxa"/>
-              <w:bottom w:w="0" w:type="dxa"/>
-              <w:end w:w="0" w:type="dxa"/>
-            </w:tcMar>
+            <w:tcBorders>
+              <w:top w:val="nil"/>
+              <w:left w:val="nil"/>
+              <w:bottom w:val="nil"/>
+              <w:right w:val="nil"/>
+            </w:tcBorders>
           </w:tcPr>
           <w:p>
             <w:pPr>
-              <w:keepNext/>
-              <w:spacing w:before="0" w:after="0"/>
+              <w:spacing w:after="0"/>
             </w:pPr>
             <w:r>
               <w:rPr>
-                <w:rFonts w:ascii="Times New Roman" w:hAnsi="Times New Roman"/>
                 <w:b/>
-                <w:color w:val="111111"/>
-                <w:sz w:val="16"/>
+                <w:i w:val="0"/>
+                <w:sz w:val="18"/>
               </w:rPr>
               <w:t>UESTC / University of Glasgow</w:t>
             </w:r>
@@ -252,26 +239,25 @@
         </w:tc>
         <w:tc>
           <w:tcPr>
-            <w:tcW w:type="dxa" w:w="2160"/>
+            <w:tcW w:type="dxa" w:w="2232"/>
             <w:vAlign w:val="center"/>
-            <w:tcMar>
-              <w:top w:w="0" w:type="dxa"/>
-              <w:start w:w="0" w:type="dxa"/>
-              <w:bottom w:w="0" w:type="dxa"/>
-              <w:end w:w="0" w:type="dxa"/>
-            </w:tcMar>
+            <w:tcBorders>
+              <w:top w:val="nil"/>
+              <w:left w:val="nil"/>
+              <w:bottom w:val="nil"/>
+              <w:right w:val="nil"/>
+            </w:tcBorders>
           </w:tcPr>
           <w:p>
             <w:pPr>
-              <w:keepNext/>
-              <w:spacing w:before="0" w:after="0"/>
+              <w:spacing w:after="0"/>
               <w:jc w:val="right"/>
             </w:pPr>
             <w:r>
               <w:rPr>
-                <w:rFonts w:ascii="Times New Roman" w:hAnsi="Times New Roman"/>
-                <w:color w:val="111111"/>
-                <w:sz w:val="15"/>
+                <w:b/>
+                <w:i w:val="0"/>
+                <w:sz w:val="18"/>
               </w:rPr>
               <w:t>Sep 2018 - Jun 2022</w:t>
             </w:r>
@@ -281,15 +267,13 @@
     </w:tbl>
     <w:p>
       <w:pPr>
-        <w:keepNext w:val="0"/>
-        <w:spacing w:after="0"/>
+        <w:spacing w:after="20"/>
       </w:pPr>
       <w:r>
         <w:rPr>
-          <w:rFonts w:ascii="Times New Roman" w:hAnsi="Times New Roman"/>
-          <w:i/>
-          <w:color w:val="333333"/>
-          <w:sz w:val="15"/>
+          <w:b w:val="0"/>
+          <w:i w:val="0"/>
+          <w:sz w:val="17"/>
         </w:rPr>
         <w:t>B.E. in Communication Engineering; B.E. in Electronics and Electrical Engineering with Communications</w:t>
       </w:r>
@@ -297,16 +281,13 @@
     <w:p>
       <w:pPr>
         <w:keepNext/>
-        <w:spacing w:before="60" w:after="20"/>
-        <w:pBdr>
-          <w:bottom w:val="single" w:sz="5" w:space="1" w:color="7A8CA3"/>
-        </w:pBdr>
+        <w:spacing w:before="120" w:after="40"/>
       </w:pPr>
       <w:r>
         <w:rPr>
-          <w:rFonts w:ascii="Times New Roman" w:hAnsi="Times New Roman"/>
           <w:b/>
-          <w:color w:val="1F4D78"/>
+          <w:i w:val="0"/>
+          <w:color w:val="1F4F4C"/>
           <w:sz w:val="20"/>
         </w:rPr>
         <w:t>SELECTED RESEARCH PROJECTS</w:t>
@@ -314,37 +295,35 @@
     </w:p>
     <w:tbl>
       <w:tblPr>
-        <w:tblW w:type="dxa" w:w="10800"/>
+        <w:tblW w:type="auto" w:w="0"/>
         <w:tblLayout w:type="fixed"/>
         <w:tblLook w:firstColumn="1" w:firstRow="1" w:lastColumn="0" w:lastRow="0" w:noHBand="0" w:noVBand="1" w:val="04A0"/>
       </w:tblPr>
       <w:tblGrid>
-        <w:gridCol w:w="8640"/>
-        <w:gridCol w:w="2160"/>
+        <w:gridCol w:w="5328"/>
+        <w:gridCol w:w="5328"/>
       </w:tblGrid>
       <w:tr>
         <w:tc>
           <w:tcPr>
-            <w:tcW w:type="dxa" w:w="8640"/>
+            <w:tcW w:type="dxa" w:w="7704"/>
             <w:vAlign w:val="center"/>
-            <w:tcMar>
-              <w:top w:w="0" w:type="dxa"/>
-              <w:start w:w="0" w:type="dxa"/>
-              <w:bottom w:w="0" w:type="dxa"/>
-              <w:end w:w="0" w:type="dxa"/>
-            </w:tcMar>
+            <w:tcBorders>
+              <w:top w:val="nil"/>
+              <w:left w:val="nil"/>
+              <w:bottom w:val="nil"/>
+              <w:right w:val="nil"/>
+            </w:tcBorders>
           </w:tcPr>
           <w:p>
             <w:pPr>
-              <w:keepNext/>
-              <w:spacing w:before="0" w:after="0"/>
+              <w:spacing w:after="0"/>
             </w:pPr>
             <w:r>
               <w:rPr>
-                <w:rFonts w:ascii="Times New Roman" w:hAnsi="Times New Roman"/>
                 <w:b/>
-                <w:color w:val="111111"/>
-                <w:sz w:val="16"/>
+                <w:i w:val="0"/>
+                <w:sz w:val="18"/>
               </w:rPr>
               <w:t>Bunker Multi-Sensor SLAM, Localization, and Mapping</w:t>
             </w:r>
@@ -352,26 +331,25 @@
         </w:tc>
         <w:tc>
           <w:tcPr>
-            <w:tcW w:type="dxa" w:w="2160"/>
+            <w:tcW w:type="dxa" w:w="2232"/>
             <w:vAlign w:val="center"/>
-            <w:tcMar>
-              <w:top w:w="0" w:type="dxa"/>
-              <w:start w:w="0" w:type="dxa"/>
-              <w:bottom w:w="0" w:type="dxa"/>
-              <w:end w:w="0" w:type="dxa"/>
-            </w:tcMar>
+            <w:tcBorders>
+              <w:top w:val="nil"/>
+              <w:left w:val="nil"/>
+              <w:bottom w:val="nil"/>
+              <w:right w:val="nil"/>
+            </w:tcBorders>
           </w:tcPr>
           <w:p>
             <w:pPr>
-              <w:keepNext/>
-              <w:spacing w:before="0" w:after="0"/>
+              <w:spacing w:after="0"/>
               <w:jc w:val="right"/>
             </w:pPr>
             <w:r>
               <w:rPr>
-                <w:rFonts w:ascii="Times New Roman" w:hAnsi="Times New Roman"/>
-                <w:color w:val="111111"/>
-                <w:sz w:val="15"/>
+                <w:b/>
+                <w:i w:val="0"/>
+                <w:sz w:val="18"/>
               </w:rPr>
               <w:t>Aug 2025 - Present</w:t>
             </w:r>
@@ -382,14 +360,14 @@
     <w:p>
       <w:pPr>
         <w:keepNext/>
-        <w:spacing w:after="0"/>
+        <w:spacing w:after="20"/>
       </w:pPr>
       <w:r>
         <w:rPr>
-          <w:rFonts w:ascii="Times New Roman" w:hAnsi="Times New Roman"/>
+          <w:b w:val="0"/>
           <w:i/>
-          <w:color w:val="333333"/>
-          <w:sz w:val="15"/>
+          <w:color w:val="5D6864"/>
+          <w:sz w:val="17"/>
         </w:rPr>
         <w:t>Research Project | Prof. Shunqiao Sun and Prof. Igal Bilik | The University of Alabama / Ben-Gurion University</w:t>
       </w:r>
@@ -397,14 +375,15 @@
     <w:p>
       <w:pPr>
         <w:pStyle w:val="ListBullet"/>
-        <w:spacing w:after="0"/>
-        <w:ind w:left="230" w:hanging="144"/>
+        <w:keepLines/>
+        <w:spacing w:after="12" w:line="240" w:lineRule="auto"/>
+        <w:ind w:left="259" w:hanging="173"/>
       </w:pPr>
       <w:r>
         <w:rPr>
-          <w:rFonts w:ascii="Times New Roman" w:hAnsi="Times New Roman"/>
-          <w:color w:val="111111"/>
-          <w:sz w:val="15"/>
+          <w:b w:val="0"/>
+          <w:i w:val="0"/>
+          <w:sz w:val="17"/>
         </w:rPr>
         <w:t>Built a ROS2-based UGV perception and evaluation stack for bunker, low-light, and GNSS-degraded field runs, synchronizing camera, LiDAR, 4D radar, INS/RTK, wheel feedback, and driver-control data.</w:t>
       </w:r>
@@ -412,14 +391,15 @@
     <w:p>
       <w:pPr>
         <w:pStyle w:val="ListBullet"/>
-        <w:spacing w:after="0"/>
-        <w:ind w:left="230" w:hanging="144"/>
+        <w:keepLines/>
+        <w:spacing w:after="12" w:line="240" w:lineRule="auto"/>
+        <w:ind w:left="259" w:hanging="173"/>
       </w:pPr>
       <w:r>
         <w:rPr>
-          <w:rFonts w:ascii="Times New Roman" w:hAnsi="Times New Roman"/>
-          <w:color w:val="111111"/>
-          <w:sz w:val="15"/>
+          <w:b w:val="0"/>
+          <w:i w:val="0"/>
+          <w:sz w:val="17"/>
         </w:rPr>
         <w:t>Developed real-time LiDAR localization and soft-anchor mapping workflows; reduced a 459.5M-point raw scan stream to a 2.13M-point map (99.5% reduction) and cleaned a 24.29M-point map to 13.56M points.</w:t>
       </w:r>
@@ -427,81 +407,66 @@
     <w:p>
       <w:pPr>
         <w:pStyle w:val="ListBullet"/>
-        <w:spacing w:after="0"/>
-        <w:ind w:left="230" w:hanging="144"/>
+        <w:keepLines/>
+        <w:spacing w:after="12" w:line="240" w:lineRule="auto"/>
+        <w:ind w:left="259" w:hanging="173"/>
       </w:pPr>
       <w:r>
         <w:rPr>
-          <w:rFonts w:ascii="Times New Roman" w:hAnsi="Times New Roman"/>
-          <w:color w:val="111111"/>
-          <w:sz w:val="15"/>
+          <w:b w:val="0"/>
+          <w:i w:val="0"/>
+          <w:sz w:val="17"/>
         </w:rPr>
-        <w:t>Improved radar localization through IMU-aided fusion and sensor-specific parameter tuning, using INS/RTK alignment as the reference for trajectory evaluation and failure-case analysis.</w:t>
+        <w:t>Improved radar localization through IMU-aided fusion and sensor-specific tuning, using INS/RTK alignment as the reference for trajectory evaluation and failure-case analysis.</w:t>
       </w:r>
     </w:p>
     <w:p>
       <w:pPr>
         <w:pStyle w:val="ListBullet"/>
-        <w:spacing w:after="0"/>
-        <w:ind w:left="230" w:hanging="144"/>
+        <w:keepLines/>
+        <w:spacing w:after="12" w:line="240" w:lineRule="auto"/>
+        <w:ind w:left="259" w:hanging="173"/>
       </w:pPr>
       <w:r>
         <w:rPr>
-          <w:rFonts w:ascii="Times New Roman" w:hAnsi="Times New Roman"/>
-          <w:color w:val="111111"/>
-          <w:sz w:val="15"/>
+          <w:b w:val="0"/>
+          <w:i w:val="0"/>
+          <w:sz w:val="17"/>
         </w:rPr>
         <w:t>Evaluated radar, visual, and LiDAR-inertial localization in a low-light, building-occluded sequence; radar odometry reached 7.16 m ATE RMSE versus 35.47 m for visual SLAM and 35.57 m for a LiDAR-inertial baseline.</w:t>
       </w:r>
     </w:p>
-    <w:p>
-      <w:pPr>
-        <w:pStyle w:val="ListBullet"/>
-        <w:spacing w:after="0"/>
-        <w:ind w:left="230" w:hanging="144"/>
-      </w:pPr>
-      <w:r>
-        <w:rPr>
-          <w:rFonts w:ascii="Times New Roman" w:hAnsi="Times New Roman"/>
-          <w:color w:val="111111"/>
-          <w:sz w:val="15"/>
-        </w:rPr>
-        <w:t>Prepared camera-view, radar/LiDAR point-cloud, and top-view trajectory diagnostics to compare sensor behavior across bunker turns, occluded areas, and low-visibility segments.</w:t>
-      </w:r>
-    </w:p>
     <w:tbl>
       <w:tblPr>
-        <w:tblW w:type="dxa" w:w="10800"/>
+        <w:tblW w:type="auto" w:w="0"/>
         <w:tblLayout w:type="fixed"/>
         <w:tblLook w:firstColumn="1" w:firstRow="1" w:lastColumn="0" w:lastRow="0" w:noHBand="0" w:noVBand="1" w:val="04A0"/>
       </w:tblPr>
       <w:tblGrid>
-        <w:gridCol w:w="8640"/>
-        <w:gridCol w:w="2160"/>
+        <w:gridCol w:w="5328"/>
+        <w:gridCol w:w="5328"/>
       </w:tblGrid>
       <w:tr>
         <w:tc>
           <w:tcPr>
-            <w:tcW w:type="dxa" w:w="8640"/>
+            <w:tcW w:type="dxa" w:w="7704"/>
             <w:vAlign w:val="center"/>
-            <w:tcMar>
-              <w:top w:w="0" w:type="dxa"/>
-              <w:start w:w="0" w:type="dxa"/>
-              <w:bottom w:w="0" w:type="dxa"/>
-              <w:end w:w="0" w:type="dxa"/>
-            </w:tcMar>
+            <w:tcBorders>
+              <w:top w:val="nil"/>
+              <w:left w:val="nil"/>
+              <w:bottom w:val="nil"/>
+              <w:right w:val="nil"/>
+            </w:tcBorders>
           </w:tcPr>
           <w:p>
             <w:pPr>
-              <w:keepNext/>
-              <w:spacing w:before="0" w:after="0"/>
+              <w:spacing w:after="0"/>
             </w:pPr>
             <w:r>
               <w:rPr>
-                <w:rFonts w:ascii="Times New Roman" w:hAnsi="Times New Roman"/>
                 <w:b/>
-                <w:color w:val="111111"/>
-                <w:sz w:val="16"/>
+                <w:i w:val="0"/>
+                <w:sz w:val="18"/>
               </w:rPr>
               <w:t>Learning-Based 4D Radar Odometry and Camera Fusion</w:t>
             </w:r>
@@ -509,26 +474,25 @@
         </w:tc>
         <w:tc>
           <w:tcPr>
-            <w:tcW w:type="dxa" w:w="2160"/>
+            <w:tcW w:type="dxa" w:w="2232"/>
             <w:vAlign w:val="center"/>
-            <w:tcMar>
-              <w:top w:w="0" w:type="dxa"/>
-              <w:start w:w="0" w:type="dxa"/>
-              <w:bottom w:w="0" w:type="dxa"/>
-              <w:end w:w="0" w:type="dxa"/>
-            </w:tcMar>
+            <w:tcBorders>
+              <w:top w:val="nil"/>
+              <w:left w:val="nil"/>
+              <w:bottom w:val="nil"/>
+              <w:right w:val="nil"/>
+            </w:tcBorders>
           </w:tcPr>
           <w:p>
             <w:pPr>
-              <w:keepNext/>
-              <w:spacing w:before="0" w:after="0"/>
+              <w:spacing w:after="0"/>
               <w:jc w:val="right"/>
             </w:pPr>
             <w:r>
               <w:rPr>
-                <w:rFonts w:ascii="Times New Roman" w:hAnsi="Times New Roman"/>
-                <w:color w:val="111111"/>
-                <w:sz w:val="15"/>
+                <w:b/>
+                <w:i w:val="0"/>
+                <w:sz w:val="18"/>
               </w:rPr>
               <w:t>Jan 2026 - Present</w:t>
             </w:r>
@@ -539,14 +503,14 @@
     <w:p>
       <w:pPr>
         <w:keepNext/>
-        <w:spacing w:after="0"/>
+        <w:spacing w:after="20"/>
       </w:pPr>
       <w:r>
         <w:rPr>
-          <w:rFonts w:ascii="Times New Roman" w:hAnsi="Times New Roman"/>
+          <w:b w:val="0"/>
           <w:i/>
-          <w:color w:val="333333"/>
-          <w:sz w:val="15"/>
+          <w:color w:val="5D6864"/>
+          <w:sz w:val="17"/>
         </w:rPr>
         <w:t>Research Project | Prof. Shunqiao Sun | The University of Alabama</w:t>
       </w:r>
@@ -554,14 +518,15 @@
     <w:p>
       <w:pPr>
         <w:pStyle w:val="ListBullet"/>
-        <w:spacing w:after="0"/>
-        <w:ind w:left="230" w:hanging="144"/>
+        <w:keepLines/>
+        <w:spacing w:after="12" w:line="240" w:lineRule="auto"/>
+        <w:ind w:left="259" w:hanging="173"/>
       </w:pPr>
       <w:r>
         <w:rPr>
-          <w:rFonts w:ascii="Times New Roman" w:hAnsi="Times New Roman"/>
-          <w:color w:val="111111"/>
-          <w:sz w:val="15"/>
+          <w:b w:val="0"/>
+          <w:i w:val="0"/>
+          <w:sz w:val="17"/>
         </w:rPr>
         <w:t>Extended a learning-based 4D radar odometry pipeline for sparse radar point clouds, adding range/intensity pre-filtering and point-multiplication experiments to improve usable geometric structure before pose estimation.</w:t>
       </w:r>
@@ -569,14 +534,15 @@
     <w:p>
       <w:pPr>
         <w:pStyle w:val="ListBullet"/>
-        <w:spacing w:after="0"/>
-        <w:ind w:left="230" w:hanging="144"/>
+        <w:keepLines/>
+        <w:spacing w:after="12" w:line="240" w:lineRule="auto"/>
+        <w:ind w:left="259" w:hanging="173"/>
       </w:pPr>
       <w:r>
         <w:rPr>
-          <w:rFonts w:ascii="Times New Roman" w:hAnsi="Times New Roman"/>
-          <w:color w:val="111111"/>
-          <w:sz w:val="15"/>
+          <w:b w:val="0"/>
+          <w:i w:val="0"/>
+          <w:sz w:val="17"/>
         </w:rPr>
         <w:t>Built two-stage odometry experiments that first stabilize radar pose outputs and then evaluate camera-pose fusion, including an MLP-based module for combining camera estimates with radar trajectories.</w:t>
       </w:r>
@@ -584,14 +550,15 @@
     <w:p>
       <w:pPr>
         <w:pStyle w:val="ListBullet"/>
-        <w:spacing w:after="0"/>
-        <w:ind w:left="230" w:hanging="144"/>
+        <w:keepLines/>
+        <w:spacing w:after="12" w:line="240" w:lineRule="auto"/>
+        <w:ind w:left="259" w:hanging="173"/>
       </w:pPr>
       <w:r>
         <w:rPr>
-          <w:rFonts w:ascii="Times New Roman" w:hAnsi="Times New Roman"/>
-          <w:color w:val="111111"/>
-          <w:sz w:val="15"/>
+          <w:b w:val="0"/>
+          <w:i w:val="0"/>
+          <w:sz w:val="17"/>
         </w:rPr>
         <w:t>Added lightweight pseudo-correspondence supervision while preserving the original pose backbone; introduced 84.1K trainable parameters, about 0.53% of the full model, for correspondence and offset learning.</w:t>
       </w:r>
@@ -599,66 +566,50 @@
     <w:p>
       <w:pPr>
         <w:pStyle w:val="ListBullet"/>
-        <w:spacing w:after="0"/>
-        <w:ind w:left="230" w:hanging="144"/>
+        <w:keepLines/>
+        <w:spacing w:after="12" w:line="240" w:lineRule="auto"/>
+        <w:ind w:left="259" w:hanging="173"/>
       </w:pPr>
       <w:r>
         <w:rPr>
-          <w:rFonts w:ascii="Times New Roman" w:hAnsi="Times New Roman"/>
-          <w:color w:val="111111"/>
-          <w:sz w:val="15"/>
+          <w:b w:val="0"/>
+          <w:i w:val="0"/>
+          <w:sz w:val="17"/>
         </w:rPr>
         <w:t>Reduced correspondence loss by 36.0%, match/static losses by about 36.8%, and offset error from 0.409 m to 0.363 m in frozen-backbone ablations; guarded refinement reduced translation RMSE from 0.752 m to 0.311 m.</w:t>
       </w:r>
     </w:p>
-    <w:p>
-      <w:pPr>
-        <w:pStyle w:val="ListBullet"/>
-        <w:spacing w:after="0"/>
-        <w:ind w:left="230" w:hanging="144"/>
-      </w:pPr>
-      <w:r>
-        <w:rPr>
-          <w:rFonts w:ascii="Times New Roman" w:hAnsi="Times New Roman"/>
-          <w:color w:val="111111"/>
-          <w:sz w:val="15"/>
-        </w:rPr>
-        <w:t>Maintained frozen-backbone and guarded-refinement ablations to separate correspondence-learning gains from pose-backbone changes, keeping trajectory comparisons consistent across variants.</w:t>
-      </w:r>
-    </w:p>
     <w:tbl>
       <w:tblPr>
-        <w:tblW w:type="dxa" w:w="10800"/>
+        <w:tblW w:type="auto" w:w="0"/>
         <w:tblLayout w:type="fixed"/>
         <w:tblLook w:firstColumn="1" w:firstRow="1" w:lastColumn="0" w:lastRow="0" w:noHBand="0" w:noVBand="1" w:val="04A0"/>
       </w:tblPr>
       <w:tblGrid>
-        <w:gridCol w:w="8640"/>
-        <w:gridCol w:w="2160"/>
+        <w:gridCol w:w="5328"/>
+        <w:gridCol w:w="5328"/>
       </w:tblGrid>
       <w:tr>
         <w:tc>
           <w:tcPr>
-            <w:tcW w:type="dxa" w:w="8640"/>
+            <w:tcW w:type="dxa" w:w="7704"/>
             <w:vAlign w:val="center"/>
-            <w:tcMar>
-              <w:top w:w="0" w:type="dxa"/>
-              <w:start w:w="0" w:type="dxa"/>
-              <w:bottom w:w="0" w:type="dxa"/>
-              <w:end w:w="0" w:type="dxa"/>
-            </w:tcMar>
+            <w:tcBorders>
+              <w:top w:val="nil"/>
+              <w:left w:val="nil"/>
+              <w:bottom w:val="nil"/>
+              <w:right w:val="nil"/>
+            </w:tcBorders>
           </w:tcPr>
           <w:p>
             <w:pPr>
-              <w:keepNext/>
-              <w:spacing w:before="0" w:after="0"/>
+              <w:spacing w:after="0"/>
             </w:pPr>
             <w:r>
               <w:rPr>
-                <w:rFonts w:ascii="Times New Roman" w:hAnsi="Times New Roman"/>
                 <w:b/>
-                <w:color w:val="111111"/>
-                <w:sz w:val="16"/>
+                <w:i w:val="0"/>
+                <w:sz w:val="18"/>
               </w:rPr>
               <w:t>NXP Radar DDM Decoding</w:t>
             </w:r>
@@ -666,26 +617,25 @@
         </w:tc>
         <w:tc>
           <w:tcPr>
-            <w:tcW w:type="dxa" w:w="2160"/>
+            <w:tcW w:type="dxa" w:w="2232"/>
             <w:vAlign w:val="center"/>
-            <w:tcMar>
-              <w:top w:w="0" w:type="dxa"/>
-              <w:start w:w="0" w:type="dxa"/>
-              <w:bottom w:w="0" w:type="dxa"/>
-              <w:end w:w="0" w:type="dxa"/>
-            </w:tcMar>
+            <w:tcBorders>
+              <w:top w:val="nil"/>
+              <w:left w:val="nil"/>
+              <w:bottom w:val="nil"/>
+              <w:right w:val="nil"/>
+            </w:tcBorders>
           </w:tcPr>
           <w:p>
             <w:pPr>
-              <w:keepNext/>
-              <w:spacing w:before="0" w:after="0"/>
+              <w:spacing w:after="0"/>
               <w:jc w:val="right"/>
             </w:pPr>
             <w:r>
               <w:rPr>
-                <w:rFonts w:ascii="Times New Roman" w:hAnsi="Times New Roman"/>
-                <w:color w:val="111111"/>
-                <w:sz w:val="15"/>
+                <w:b/>
+                <w:i w:val="0"/>
+                <w:sz w:val="18"/>
               </w:rPr>
               <w:t>Aug 2025 - Present</w:t>
             </w:r>
@@ -696,29 +646,30 @@
     <w:p>
       <w:pPr>
         <w:keepNext/>
-        <w:spacing w:after="0"/>
+        <w:spacing w:after="20"/>
       </w:pPr>
       <w:r>
         <w:rPr>
-          <w:rFonts w:ascii="Times New Roman" w:hAnsi="Times New Roman"/>
+          <w:b w:val="0"/>
           <w:i/>
-          <w:color w:val="333333"/>
-          <w:sz w:val="15"/>
+          <w:color w:val="5D6864"/>
+          <w:sz w:val="17"/>
         </w:rPr>
-        <w:t>NXP collaborative radar signal-processing project</w:t>
+        <w:t>Collaborative radar signal-processing project</w:t>
       </w:r>
     </w:p>
     <w:p>
       <w:pPr>
         <w:pStyle w:val="ListBullet"/>
-        <w:spacing w:after="0"/>
-        <w:ind w:left="230" w:hanging="144"/>
+        <w:keepLines/>
+        <w:spacing w:after="12" w:line="240" w:lineRule="auto"/>
+        <w:ind w:left="259" w:hanging="173"/>
       </w:pPr>
       <w:r>
         <w:rPr>
-          <w:rFonts w:ascii="Times New Roman" w:hAnsi="Times New Roman"/>
-          <w:color w:val="111111"/>
-          <w:sz w:val="15"/>
+          <w:b w:val="0"/>
+          <w:i w:val="0"/>
+          <w:sz w:val="17"/>
         </w:rPr>
         <w:t>Developed a MATLAB SFW/DDM simulation and decoding pipeline for 12-TX/12-RX, 1024-sample, 512-chirp radar data with multi-TX de-spreading and range-Doppler fusion.</w:t>
       </w:r>
@@ -726,14 +677,15 @@
     <w:p>
       <w:pPr>
         <w:pStyle w:val="ListBullet"/>
-        <w:spacing w:after="0"/>
-        <w:ind w:left="230" w:hanging="144"/>
+        <w:keepLines/>
+        <w:spacing w:after="12" w:line="240" w:lineRule="auto"/>
+        <w:ind w:left="259" w:hanging="173"/>
       </w:pPr>
       <w:r>
         <w:rPr>
-          <w:rFonts w:ascii="Times New Roman" w:hAnsi="Times New Roman"/>
-          <w:color w:val="111111"/>
-          <w:sz w:val="15"/>
+          <w:b w:val="0"/>
+          <w:i w:val="0"/>
+          <w:sz w:val="17"/>
         </w:rPr>
         <w:t>Implemented CA-CFAR and DBSCAN-based target extraction to separate DDM ghost artifacts, SFW Doppler offsets, and velocity-induced Doppler smearing in staged validation scenarios.</w:t>
       </w:r>
@@ -741,14 +693,15 @@
     <w:p>
       <w:pPr>
         <w:pStyle w:val="ListBullet"/>
-        <w:spacing w:after="0"/>
-        <w:ind w:left="230" w:hanging="144"/>
+        <w:keepLines/>
+        <w:spacing w:after="12" w:line="240" w:lineRule="auto"/>
+        <w:ind w:left="259" w:hanging="173"/>
       </w:pPr>
       <w:r>
         <w:rPr>
-          <w:rFonts w:ascii="Times New Roman" w:hAnsi="Times New Roman"/>
-          <w:color w:val="111111"/>
-          <w:sz w:val="15"/>
+          <w:b w:val="0"/>
+          <w:i w:val="0"/>
+          <w:sz w:val="17"/>
         </w:rPr>
         <w:t>Designed velocity-search and quadratic phase-correction desmearing, validating a 320-candidate search on close targets with 2 m range separation and 40 m/s velocity difference.</w:t>
       </w:r>
@@ -756,16 +709,13 @@
     <w:p>
       <w:pPr>
         <w:keepNext/>
-        <w:spacing w:before="60" w:after="20"/>
-        <w:pBdr>
-          <w:bottom w:val="single" w:sz="5" w:space="1" w:color="7A8CA3"/>
-        </w:pBdr>
+        <w:spacing w:before="120" w:after="40"/>
       </w:pPr>
       <w:r>
         <w:rPr>
-          <w:rFonts w:ascii="Times New Roman" w:hAnsi="Times New Roman"/>
           <w:b/>
-          <w:color w:val="1F4D78"/>
+          <w:i w:val="0"/>
+          <w:color w:val="1F4F4C"/>
           <w:sz w:val="20"/>
         </w:rPr>
         <w:t>PRIOR RESEARCH EXPERIENCE</w:t>
@@ -773,37 +723,35 @@
     </w:p>
     <w:tbl>
       <w:tblPr>
-        <w:tblW w:type="dxa" w:w="10800"/>
+        <w:tblW w:type="auto" w:w="0"/>
         <w:tblLayout w:type="fixed"/>
         <w:tblLook w:firstColumn="1" w:firstRow="1" w:lastColumn="0" w:lastRow="0" w:noHBand="0" w:noVBand="1" w:val="04A0"/>
       </w:tblPr>
       <w:tblGrid>
-        <w:gridCol w:w="8640"/>
-        <w:gridCol w:w="2160"/>
+        <w:gridCol w:w="5328"/>
+        <w:gridCol w:w="5328"/>
       </w:tblGrid>
       <w:tr>
         <w:tc>
           <w:tcPr>
-            <w:tcW w:type="dxa" w:w="8640"/>
+            <w:tcW w:type="dxa" w:w="7704"/>
             <w:vAlign w:val="center"/>
-            <w:tcMar>
-              <w:top w:w="0" w:type="dxa"/>
-              <w:start w:w="0" w:type="dxa"/>
-              <w:bottom w:w="0" w:type="dxa"/>
-              <w:end w:w="0" w:type="dxa"/>
-            </w:tcMar>
+            <w:tcBorders>
+              <w:top w:val="nil"/>
+              <w:left w:val="nil"/>
+              <w:bottom w:val="nil"/>
+              <w:right w:val="nil"/>
+            </w:tcBorders>
           </w:tcPr>
           <w:p>
             <w:pPr>
-              <w:keepNext/>
-              <w:spacing w:before="0" w:after="0"/>
+              <w:spacing w:after="0"/>
             </w:pPr>
             <w:r>
               <w:rPr>
-                <w:rFonts w:ascii="Times New Roman" w:hAnsi="Times New Roman"/>
                 <w:b/>
-                <w:color w:val="111111"/>
-                <w:sz w:val="16"/>
+                <w:i w:val="0"/>
+                <w:sz w:val="18"/>
               </w:rPr>
               <w:t>MVMD-Based CSP for EEG Signal Classification</w:t>
             </w:r>
@@ -811,26 +759,25 @@
         </w:tc>
         <w:tc>
           <w:tcPr>
-            <w:tcW w:type="dxa" w:w="2160"/>
+            <w:tcW w:type="dxa" w:w="2232"/>
             <w:vAlign w:val="center"/>
-            <w:tcMar>
-              <w:top w:w="0" w:type="dxa"/>
-              <w:start w:w="0" w:type="dxa"/>
-              <w:bottom w:w="0" w:type="dxa"/>
-              <w:end w:w="0" w:type="dxa"/>
-            </w:tcMar>
+            <w:tcBorders>
+              <w:top w:val="nil"/>
+              <w:left w:val="nil"/>
+              <w:bottom w:val="nil"/>
+              <w:right w:val="nil"/>
+            </w:tcBorders>
           </w:tcPr>
           <w:p>
             <w:pPr>
-              <w:keepNext/>
-              <w:spacing w:before="0" w:after="0"/>
+              <w:spacing w:after="0"/>
               <w:jc w:val="right"/>
             </w:pPr>
             <w:r>
               <w:rPr>
-                <w:rFonts w:ascii="Times New Roman" w:hAnsi="Times New Roman"/>
-                <w:color w:val="111111"/>
-                <w:sz w:val="15"/>
+                <w:b/>
+                <w:i w:val="0"/>
+                <w:sz w:val="18"/>
               </w:rPr>
               <w:t>Jun 2024 - Feb 2025</w:t>
             </w:r>
@@ -841,81 +788,113 @@
     <w:p>
       <w:pPr>
         <w:keepNext/>
-        <w:spacing w:after="0"/>
+        <w:spacing w:after="20"/>
       </w:pPr>
       <w:r>
         <w:rPr>
-          <w:rFonts w:ascii="Times New Roman" w:hAnsi="Times New Roman"/>
+          <w:b w:val="0"/>
           <w:i/>
-          <w:color w:val="333333"/>
-          <w:sz w:val="15"/>
+          <w:color w:val="5D6864"/>
+          <w:sz w:val="17"/>
         </w:rPr>
-        <w:t>Research Assistant, supervised by Prof. Aimin Jiang | Hohai University</w:t>
+        <w:t>Research Assistant | Prof. Aimin Jiang | Hohai University</w:t>
       </w:r>
     </w:p>
     <w:p>
       <w:pPr>
         <w:pStyle w:val="ListBullet"/>
-        <w:spacing w:after="0"/>
-        <w:ind w:left="230" w:hanging="144"/>
+        <w:keepLines/>
+        <w:spacing w:after="12" w:line="240" w:lineRule="auto"/>
+        <w:ind w:left="259" w:hanging="173"/>
       </w:pPr>
       <w:r>
         <w:rPr>
-          <w:rFonts w:ascii="Times New Roman" w:hAnsi="Times New Roman"/>
-          <w:color w:val="111111"/>
-          <w:sz w:val="15"/>
+          <w:b w:val="0"/>
+          <w:i w:val="0"/>
+          <w:sz w:val="17"/>
         </w:rPr>
-        <w:t>Applied MVMD and CSP/ADMM-based filters across 1,000+ EEG datasets, improving classification accuracy by about 10% while reducing computational complexity by about 20%.</w:t>
+        <w:t>Applied Multivariate Variational Mode Decomposition (MVMD) across 1,000+ EEG datasets to validate inter- and intra-subject signal variability.</w:t>
       </w:r>
     </w:p>
     <w:p>
       <w:pPr>
         <w:pStyle w:val="ListBullet"/>
-        <w:spacing w:after="0"/>
-        <w:ind w:left="230" w:hanging="144"/>
+        <w:keepLines/>
+        <w:spacing w:after="12" w:line="240" w:lineRule="auto"/>
+        <w:ind w:left="259" w:hanging="173"/>
       </w:pPr>
       <w:r>
         <w:rPr>
-          <w:rFonts w:ascii="Times New Roman" w:hAnsi="Times New Roman"/>
-          <w:color w:val="111111"/>
-          <w:sz w:val="15"/>
+          <w:b w:val="0"/>
+          <w:i w:val="0"/>
+          <w:sz w:val="17"/>
         </w:rPr>
-        <w:t>Compared MLP, LDA, and SVM classifiers to analyze inter- and intra-subject variability and validate feature robustness across EEG classification settings.</w:t>
+        <w:t>Designed a Common Spatial Pattern (CSP) algorithm that improved classification accuracy by about 10%.</w:t>
+      </w:r>
+    </w:p>
+    <w:p>
+      <w:pPr>
+        <w:pStyle w:val="ListBullet"/>
+        <w:keepLines/>
+        <w:spacing w:after="12" w:line="240" w:lineRule="auto"/>
+        <w:ind w:left="259" w:hanging="173"/>
+      </w:pPr>
+      <w:r>
+        <w:rPr>
+          <w:b w:val="0"/>
+          <w:i w:val="0"/>
+          <w:sz w:val="17"/>
+        </w:rPr>
+        <w:t>Optimized spatial and mode filters with ADMM and reduced computational complexity by about 20%.</w:t>
+      </w:r>
+    </w:p>
+    <w:p>
+      <w:pPr>
+        <w:pStyle w:val="ListBullet"/>
+        <w:keepLines/>
+        <w:spacing w:after="12" w:line="240" w:lineRule="auto"/>
+        <w:ind w:left="259" w:hanging="173"/>
+      </w:pPr>
+      <w:r>
+        <w:rPr>
+          <w:b w:val="0"/>
+          <w:i w:val="0"/>
+          <w:sz w:val="17"/>
+        </w:rPr>
+        <w:t>Compared MLP, LDA, and SVM classifiers to validate feature robustness across EEG classification settings.</w:t>
       </w:r>
     </w:p>
     <w:tbl>
       <w:tblPr>
-        <w:tblW w:type="dxa" w:w="10800"/>
+        <w:tblW w:type="auto" w:w="0"/>
         <w:tblLayout w:type="fixed"/>
         <w:tblLook w:firstColumn="1" w:firstRow="1" w:lastColumn="0" w:lastRow="0" w:noHBand="0" w:noVBand="1" w:val="04A0"/>
       </w:tblPr>
       <w:tblGrid>
-        <w:gridCol w:w="8640"/>
-        <w:gridCol w:w="2160"/>
+        <w:gridCol w:w="5328"/>
+        <w:gridCol w:w="5328"/>
       </w:tblGrid>
       <w:tr>
         <w:tc>
           <w:tcPr>
-            <w:tcW w:type="dxa" w:w="8640"/>
+            <w:tcW w:type="dxa" w:w="7704"/>
             <w:vAlign w:val="center"/>
-            <w:tcMar>
-              <w:top w:w="0" w:type="dxa"/>
-              <w:start w:w="0" w:type="dxa"/>
-              <w:bottom w:w="0" w:type="dxa"/>
-              <w:end w:w="0" w:type="dxa"/>
-            </w:tcMar>
+            <w:tcBorders>
+              <w:top w:val="nil"/>
+              <w:left w:val="nil"/>
+              <w:bottom w:val="nil"/>
+              <w:right w:val="nil"/>
+            </w:tcBorders>
           </w:tcPr>
           <w:p>
             <w:pPr>
-              <w:keepNext/>
-              <w:spacing w:before="0" w:after="0"/>
+              <w:spacing w:after="0"/>
             </w:pPr>
             <w:r>
               <w:rPr>
-                <w:rFonts w:ascii="Times New Roman" w:hAnsi="Times New Roman"/>
                 <w:b/>
-                <w:color w:val="111111"/>
-                <w:sz w:val="16"/>
+                <w:i w:val="0"/>
+                <w:sz w:val="18"/>
               </w:rPr>
               <w:t>NGSO Satellite In-line Interference Analysis</w:t>
             </w:r>
@@ -923,26 +902,25 @@
         </w:tc>
         <w:tc>
           <w:tcPr>
-            <w:tcW w:type="dxa" w:w="2160"/>
+            <w:tcW w:type="dxa" w:w="2232"/>
             <w:vAlign w:val="center"/>
-            <w:tcMar>
-              <w:top w:w="0" w:type="dxa"/>
-              <w:start w:w="0" w:type="dxa"/>
-              <w:bottom w:w="0" w:type="dxa"/>
-              <w:end w:w="0" w:type="dxa"/>
-            </w:tcMar>
+            <w:tcBorders>
+              <w:top w:val="nil"/>
+              <w:left w:val="nil"/>
+              <w:bottom w:val="nil"/>
+              <w:right w:val="nil"/>
+            </w:tcBorders>
           </w:tcPr>
           <w:p>
             <w:pPr>
-              <w:keepNext/>
-              <w:spacing w:before="0" w:after="0"/>
+              <w:spacing w:after="0"/>
               <w:jc w:val="right"/>
             </w:pPr>
             <w:r>
               <w:rPr>
-                <w:rFonts w:ascii="Times New Roman" w:hAnsi="Times New Roman"/>
-                <w:color w:val="111111"/>
-                <w:sz w:val="15"/>
+                <w:b/>
+                <w:i w:val="0"/>
+                <w:sz w:val="18"/>
               </w:rPr>
               <w:t>Aug 2023 - Jan 2024</w:t>
             </w:r>
@@ -953,61 +931,457 @@
     <w:p>
       <w:pPr>
         <w:keepNext/>
-        <w:spacing w:after="0"/>
+        <w:spacing w:after="20"/>
       </w:pPr>
       <w:r>
         <w:rPr>
-          <w:rFonts w:ascii="Times New Roman" w:hAnsi="Times New Roman"/>
+          <w:b w:val="0"/>
           <w:i/>
-          <w:color w:val="333333"/>
-          <w:sz w:val="15"/>
+          <w:color w:val="5D6864"/>
+          <w:sz w:val="17"/>
         </w:rPr>
-        <w:t>Research Assistant, supervised by Prof. Jon Peha and Prof. Marvin Sirbu | Carnegie Mellon University</w:t>
+        <w:t>Research Assistant | Prof. Jon Peha and Prof. Marvin Sirbu | Carnegie Mellon University</w:t>
       </w:r>
     </w:p>
     <w:p>
       <w:pPr>
         <w:pStyle w:val="ListBullet"/>
-        <w:spacing w:after="0"/>
-        <w:ind w:left="230" w:hanging="144"/>
+        <w:keepLines/>
+        <w:spacing w:after="12" w:line="240" w:lineRule="auto"/>
+        <w:ind w:left="259" w:hanging="173"/>
       </w:pPr>
       <w:r>
         <w:rPr>
-          <w:rFonts w:ascii="Times New Roman" w:hAnsi="Times New Roman"/>
-          <w:color w:val="111111"/>
-          <w:sz w:val="15"/>
+          <w:b w:val="0"/>
+          <w:i w:val="0"/>
+          <w:sz w:val="17"/>
         </w:rPr>
-        <w:t>Modeled satellite-ground communication links with TLE data in MATLAB and Python, processing million-scale datasets and reducing estimated interference probabilities by 30%.</w:t>
+        <w:t>Simulated satellite-ground communication links with TLE data in MATLAB and Python, processing million-scale datasets and achieving location accuracy within 1 km.</w:t>
       </w:r>
     </w:p>
     <w:p>
       <w:pPr>
         <w:pStyle w:val="ListBullet"/>
-        <w:spacing w:after="0"/>
-        <w:ind w:left="230" w:hanging="144"/>
+        <w:keepLines/>
+        <w:spacing w:after="12" w:line="240" w:lineRule="auto"/>
+        <w:ind w:left="259" w:hanging="173"/>
       </w:pPr>
       <w:r>
         <w:rPr>
-          <w:rFonts w:ascii="Times New Roman" w:hAnsi="Times New Roman"/>
-          <w:color w:val="111111"/>
-          <w:sz w:val="15"/>
+          <w:b w:val="0"/>
+          <w:i w:val="0"/>
+          <w:sz w:val="17"/>
         </w:rPr>
-        <w:t>Designed an interference-avoidance simulation workflow that reduced computational cost by about 60% while preserving scenario-level link and geometry analysis.</w:t>
+        <w:t>Developed a custom simulation model to quantify in-line interference across satellite constellations under different communication protocols.</w:t>
+      </w:r>
+    </w:p>
+    <w:p>
+      <w:pPr>
+        <w:pStyle w:val="ListBullet"/>
+        <w:keepLines/>
+        <w:spacing w:after="12" w:line="240" w:lineRule="auto"/>
+        <w:ind w:left="259" w:hanging="173"/>
+      </w:pPr>
+      <w:r>
+        <w:rPr>
+          <w:b w:val="0"/>
+          <w:i w:val="0"/>
+          <w:sz w:val="17"/>
+        </w:rPr>
+        <w:t>Enhanced simulation coverage for multiple satellite communication models, reducing computational cost by about 60%.</w:t>
+      </w:r>
+    </w:p>
+    <w:p>
+      <w:pPr>
+        <w:pStyle w:val="ListBullet"/>
+        <w:keepLines/>
+        <w:spacing w:after="12" w:line="240" w:lineRule="auto"/>
+        <w:ind w:left="259" w:hanging="173"/>
+      </w:pPr>
+      <w:r>
+        <w:rPr>
+          <w:b w:val="0"/>
+          <w:i w:val="0"/>
+          <w:sz w:val="17"/>
+        </w:rPr>
+        <w:t>Designed and tested an interference-avoidance algorithm that reduced estimated interference probabilities by 30%.</w:t>
+      </w:r>
+    </w:p>
+    <w:tbl>
+      <w:tblPr>
+        <w:tblW w:type="auto" w:w="0"/>
+        <w:tblLayout w:type="fixed"/>
+        <w:tblLook w:firstColumn="1" w:firstRow="1" w:lastColumn="0" w:lastRow="0" w:noHBand="0" w:noVBand="1" w:val="04A0"/>
+      </w:tblPr>
+      <w:tblGrid>
+        <w:gridCol w:w="5328"/>
+        <w:gridCol w:w="5328"/>
+      </w:tblGrid>
+      <w:tr>
+        <w:tc>
+          <w:tcPr>
+            <w:tcW w:type="dxa" w:w="7704"/>
+            <w:vAlign w:val="center"/>
+            <w:tcBorders>
+              <w:top w:val="nil"/>
+              <w:left w:val="nil"/>
+              <w:bottom w:val="nil"/>
+              <w:right w:val="nil"/>
+            </w:tcBorders>
+          </w:tcPr>
+          <w:p>
+            <w:pPr>
+              <w:spacing w:after="0"/>
+            </w:pPr>
+            <w:r>
+              <w:rPr>
+                <w:b/>
+                <w:i w:val="0"/>
+                <w:sz w:val="18"/>
+              </w:rPr>
+              <w:t>Low-Noise Balanced Photodetector for Single Photon Detection</w:t>
+            </w:r>
+          </w:p>
+        </w:tc>
+        <w:tc>
+          <w:tcPr>
+            <w:tcW w:type="dxa" w:w="2232"/>
+            <w:vAlign w:val="center"/>
+            <w:tcBorders>
+              <w:top w:val="nil"/>
+              <w:left w:val="nil"/>
+              <w:bottom w:val="nil"/>
+              <w:right w:val="nil"/>
+            </w:tcBorders>
+          </w:tcPr>
+          <w:p>
+            <w:pPr>
+              <w:spacing w:after="0"/>
+              <w:jc w:val="right"/>
+            </w:pPr>
+            <w:r>
+              <w:rPr>
+                <w:b/>
+                <w:i w:val="0"/>
+                <w:sz w:val="18"/>
+              </w:rPr>
+              <w:t>Sep 2021 - May 2022</w:t>
+            </w:r>
+          </w:p>
+        </w:tc>
+      </w:tr>
+    </w:tbl>
+    <w:p>
+      <w:pPr>
+        <w:keepNext/>
+        <w:spacing w:after="20"/>
+      </w:pPr>
+      <w:r>
+        <w:rPr>
+          <w:b w:val="0"/>
+          <w:i/>
+          <w:color w:val="5D6864"/>
+          <w:sz w:val="17"/>
+        </w:rPr>
+        <w:t>Research Assistant | Prof. Yunxiang Wang | UESTC</w:t>
+      </w:r>
+    </w:p>
+    <w:p>
+      <w:pPr>
+        <w:pStyle w:val="ListBullet"/>
+        <w:keepLines/>
+        <w:spacing w:after="12" w:line="240" w:lineRule="auto"/>
+        <w:ind w:left="259" w:hanging="173"/>
+      </w:pPr>
+      <w:r>
+        <w:rPr>
+          <w:b w:val="0"/>
+          <w:i w:val="0"/>
+          <w:sz w:val="17"/>
+        </w:rPr>
+        <w:t>Reduced noise and enhanced sensitivity by integrating JFETs with photodiode circuits, targeting a 300 MHz theoretical bandwidth.</w:t>
+      </w:r>
+    </w:p>
+    <w:p>
+      <w:pPr>
+        <w:pStyle w:val="ListBullet"/>
+        <w:keepLines/>
+        <w:spacing w:after="12" w:line="240" w:lineRule="auto"/>
+        <w:ind w:left="259" w:hanging="173"/>
+      </w:pPr>
+      <w:r>
+        <w:rPr>
+          <w:b w:val="0"/>
+          <w:i w:val="0"/>
+          <w:sz w:val="17"/>
+        </w:rPr>
+        <w:t>Selected and integrated a differential amplifier architecture for high-speed single-photon detection circuits.</w:t>
+      </w:r>
+    </w:p>
+    <w:p>
+      <w:pPr>
+        <w:pStyle w:val="ListBullet"/>
+        <w:keepLines/>
+        <w:spacing w:after="12" w:line="240" w:lineRule="auto"/>
+        <w:ind w:left="259" w:hanging="173"/>
+      </w:pPr>
+      <w:r>
+        <w:rPr>
+          <w:b w:val="0"/>
+          <w:i w:val="0"/>
+          <w:sz w:val="17"/>
+        </w:rPr>
+        <w:t>Evaluated eight LTspice circuit designs and optimized PCB layouts in Altium Designer to reduce oscillation and improve circuit performance.</w:t>
+      </w:r>
+    </w:p>
+    <w:tbl>
+      <w:tblPr>
+        <w:tblW w:type="auto" w:w="0"/>
+        <w:tblLayout w:type="fixed"/>
+        <w:tblLook w:firstColumn="1" w:firstRow="1" w:lastColumn="0" w:lastRow="0" w:noHBand="0" w:noVBand="1" w:val="04A0"/>
+      </w:tblPr>
+      <w:tblGrid>
+        <w:gridCol w:w="5328"/>
+        <w:gridCol w:w="5328"/>
+      </w:tblGrid>
+      <w:tr>
+        <w:tc>
+          <w:tcPr>
+            <w:tcW w:type="dxa" w:w="7704"/>
+            <w:vAlign w:val="center"/>
+            <w:tcBorders>
+              <w:top w:val="nil"/>
+              <w:left w:val="nil"/>
+              <w:bottom w:val="nil"/>
+              <w:right w:val="nil"/>
+            </w:tcBorders>
+          </w:tcPr>
+          <w:p>
+            <w:pPr>
+              <w:spacing w:after="0"/>
+            </w:pPr>
+            <w:r>
+              <w:rPr>
+                <w:b/>
+                <w:i w:val="0"/>
+                <w:sz w:val="18"/>
+              </w:rPr>
+              <w:t>5G Clustering Algorithm Simulation for Ultra-Dense Networks</w:t>
+            </w:r>
+          </w:p>
+        </w:tc>
+        <w:tc>
+          <w:tcPr>
+            <w:tcW w:type="dxa" w:w="2232"/>
+            <w:vAlign w:val="center"/>
+            <w:tcBorders>
+              <w:top w:val="nil"/>
+              <w:left w:val="nil"/>
+              <w:bottom w:val="nil"/>
+              <w:right w:val="nil"/>
+            </w:tcBorders>
+          </w:tcPr>
+          <w:p>
+            <w:pPr>
+              <w:spacing w:after="0"/>
+              <w:jc w:val="right"/>
+            </w:pPr>
+            <w:r>
+              <w:rPr>
+                <w:b/>
+                <w:i w:val="0"/>
+                <w:sz w:val="18"/>
+              </w:rPr>
+              <w:t>May 2021 - Oct 2021</w:t>
+            </w:r>
+          </w:p>
+        </w:tc>
+      </w:tr>
+    </w:tbl>
+    <w:p>
+      <w:pPr>
+        <w:keepNext/>
+        <w:spacing w:after="20"/>
+      </w:pPr>
+      <w:r>
+        <w:rPr>
+          <w:b w:val="0"/>
+          <w:i/>
+          <w:color w:val="5D6864"/>
+          <w:sz w:val="17"/>
+        </w:rPr>
+        <w:t>Research Project | Prof. Yuwei Wang | Chinese Academy of Sciences</w:t>
+      </w:r>
+    </w:p>
+    <w:p>
+      <w:pPr>
+        <w:pStyle w:val="ListBullet"/>
+        <w:keepLines/>
+        <w:spacing w:after="12" w:line="240" w:lineRule="auto"/>
+        <w:ind w:left="259" w:hanging="173"/>
+      </w:pPr>
+      <w:r>
+        <w:rPr>
+          <w:b w:val="0"/>
+          <w:i w:val="0"/>
+          <w:sz w:val="17"/>
+        </w:rPr>
+        <w:t>Developed a clustering algorithm for 5G ultra-dense networks using path-loss mitigation and frequency-management strategies to reduce serial interference.</w:t>
+      </w:r>
+    </w:p>
+    <w:p>
+      <w:pPr>
+        <w:pStyle w:val="ListBullet"/>
+        <w:keepLines/>
+        <w:spacing w:after="12" w:line="240" w:lineRule="auto"/>
+        <w:ind w:left="259" w:hanging="173"/>
+      </w:pPr>
+      <w:r>
+        <w:rPr>
+          <w:b w:val="0"/>
+          <w:i w:val="0"/>
+          <w:sz w:val="17"/>
+        </w:rPr>
+        <w:t>Validated the algorithm in NS3 simulations, achieving a reported 30% improvement in data reception rates.</w:t>
+      </w:r>
+    </w:p>
+    <w:tbl>
+      <w:tblPr>
+        <w:tblW w:type="auto" w:w="0"/>
+        <w:tblLayout w:type="fixed"/>
+        <w:tblLook w:firstColumn="1" w:firstRow="1" w:lastColumn="0" w:lastRow="0" w:noHBand="0" w:noVBand="1" w:val="04A0"/>
+      </w:tblPr>
+      <w:tblGrid>
+        <w:gridCol w:w="5328"/>
+        <w:gridCol w:w="5328"/>
+      </w:tblGrid>
+      <w:tr>
+        <w:tc>
+          <w:tcPr>
+            <w:tcW w:type="dxa" w:w="7704"/>
+            <w:vAlign w:val="center"/>
+            <w:tcBorders>
+              <w:top w:val="nil"/>
+              <w:left w:val="nil"/>
+              <w:bottom w:val="nil"/>
+              <w:right w:val="nil"/>
+            </w:tcBorders>
+          </w:tcPr>
+          <w:p>
+            <w:pPr>
+              <w:spacing w:after="0"/>
+            </w:pPr>
+            <w:r>
+              <w:rPr>
+                <w:b/>
+                <w:i w:val="0"/>
+                <w:sz w:val="18"/>
+              </w:rPr>
+              <w:t>Design and Construction of a Multi-Function Rover</w:t>
+            </w:r>
+          </w:p>
+        </w:tc>
+        <w:tc>
+          <w:tcPr>
+            <w:tcW w:type="dxa" w:w="2232"/>
+            <w:vAlign w:val="center"/>
+            <w:tcBorders>
+              <w:top w:val="nil"/>
+              <w:left w:val="nil"/>
+              <w:bottom w:val="nil"/>
+              <w:right w:val="nil"/>
+            </w:tcBorders>
+          </w:tcPr>
+          <w:p>
+            <w:pPr>
+              <w:spacing w:after="0"/>
+              <w:jc w:val="right"/>
+            </w:pPr>
+            <w:r>
+              <w:rPr>
+                <w:b/>
+                <w:i w:val="0"/>
+                <w:sz w:val="18"/>
+              </w:rPr>
+              <w:t>Feb 2021 - Jun 2021</w:t>
+            </w:r>
+          </w:p>
+        </w:tc>
+      </w:tr>
+    </w:tbl>
+    <w:p>
+      <w:pPr>
+        <w:keepNext/>
+        <w:spacing w:after="20"/>
+      </w:pPr>
+      <w:r>
+        <w:rPr>
+          <w:b w:val="0"/>
+          <w:i/>
+          <w:color w:val="5D6864"/>
+          <w:sz w:val="17"/>
+        </w:rPr>
+        <w:t>Team Project | Communication Group Lead</w:t>
+      </w:r>
+    </w:p>
+    <w:p>
+      <w:pPr>
+        <w:pStyle w:val="ListBullet"/>
+        <w:keepLines/>
+        <w:spacing w:after="12" w:line="240" w:lineRule="auto"/>
+        <w:ind w:left="259" w:hanging="173"/>
+      </w:pPr>
+      <w:r>
+        <w:rPr>
+          <w:b w:val="0"/>
+          <w:i w:val="0"/>
+          <w:sz w:val="17"/>
+        </w:rPr>
+        <w:t>Led development of a low-latency wireless communication system for a multifunctional rover, supporting real-time data exchange with the control center.</w:t>
+      </w:r>
+    </w:p>
+    <w:p>
+      <w:pPr>
+        <w:pStyle w:val="ListBullet"/>
+        <w:keepLines/>
+        <w:spacing w:after="12" w:line="240" w:lineRule="auto"/>
+        <w:ind w:left="259" w:hanging="173"/>
+      </w:pPr>
+      <w:r>
+        <w:rPr>
+          <w:b w:val="0"/>
+          <w:i w:val="0"/>
+          <w:sz w:val="17"/>
+        </w:rPr>
+        <w:t>Implemented route tracking and color recognition functions with custom sensing and control logic, achieving over 90% navigation accuracy in project tests.</w:t>
+      </w:r>
+    </w:p>
+    <w:p>
+      <w:pPr>
+        <w:pStyle w:val="ListBullet"/>
+        <w:keepLines/>
+        <w:spacing w:after="12" w:line="240" w:lineRule="auto"/>
+        <w:ind w:left="259" w:hanging="173"/>
+      </w:pPr>
+      <w:r>
+        <w:rPr>
+          <w:b w:val="0"/>
+          <w:i w:val="0"/>
+          <w:sz w:val="17"/>
+        </w:rPr>
+        <w:t>Coordinated embedded programming, circuit design, and communication-module integration under project schedule constraints.</w:t>
       </w:r>
     </w:p>
     <w:p>
       <w:pPr>
         <w:keepNext/>
-        <w:spacing w:before="60" w:after="20"/>
-        <w:pBdr>
-          <w:bottom w:val="single" w:sz="5" w:space="1" w:color="7A8CA3"/>
-        </w:pBdr>
+        <w:spacing w:before="120" w:after="40"/>
       </w:pPr>
       <w:r>
         <w:rPr>
-          <w:rFonts w:ascii="Times New Roman" w:hAnsi="Times New Roman"/>
           <w:b/>
-          <w:color w:val="1F4D78"/>
+          <w:i w:val="0"/>
+          <w:color w:val="1F4F4C"/>
           <w:sz w:val="20"/>
         </w:rPr>
         <w:t>WORK EXPERIENCE</w:t>
@@ -1015,37 +1389,35 @@
     </w:p>
     <w:tbl>
       <w:tblPr>
-        <w:tblW w:type="dxa" w:w="10800"/>
+        <w:tblW w:type="auto" w:w="0"/>
         <w:tblLayout w:type="fixed"/>
         <w:tblLook w:firstColumn="1" w:firstRow="1" w:lastColumn="0" w:lastRow="0" w:noHBand="0" w:noVBand="1" w:val="04A0"/>
       </w:tblPr>
       <w:tblGrid>
-        <w:gridCol w:w="8640"/>
-        <w:gridCol w:w="2160"/>
+        <w:gridCol w:w="5328"/>
+        <w:gridCol w:w="5328"/>
       </w:tblGrid>
       <w:tr>
         <w:tc>
           <w:tcPr>
-            <w:tcW w:type="dxa" w:w="8640"/>
+            <w:tcW w:type="dxa" w:w="7704"/>
             <w:vAlign w:val="center"/>
-            <w:tcMar>
-              <w:top w:w="0" w:type="dxa"/>
-              <w:start w:w="0" w:type="dxa"/>
-              <w:bottom w:w="0" w:type="dxa"/>
-              <w:end w:w="0" w:type="dxa"/>
-            </w:tcMar>
+            <w:tcBorders>
+              <w:top w:val="nil"/>
+              <w:left w:val="nil"/>
+              <w:bottom w:val="nil"/>
+              <w:right w:val="nil"/>
+            </w:tcBorders>
           </w:tcPr>
           <w:p>
             <w:pPr>
-              <w:keepNext/>
-              <w:spacing w:before="0" w:after="0"/>
+              <w:spacing w:after="0"/>
             </w:pPr>
             <w:r>
               <w:rPr>
-                <w:rFonts w:ascii="Times New Roman" w:hAnsi="Times New Roman"/>
                 <w:b/>
-                <w:color w:val="111111"/>
-                <w:sz w:val="16"/>
+                <w:i w:val="0"/>
+                <w:sz w:val="18"/>
               </w:rPr>
               <w:t>CMU Center for Technology Transfer and Enterprise Creation</w:t>
             </w:r>
@@ -1053,26 +1425,25 @@
         </w:tc>
         <w:tc>
           <w:tcPr>
-            <w:tcW w:type="dxa" w:w="2160"/>
+            <w:tcW w:type="dxa" w:w="2232"/>
             <w:vAlign w:val="center"/>
-            <w:tcMar>
-              <w:top w:w="0" w:type="dxa"/>
-              <w:start w:w="0" w:type="dxa"/>
-              <w:bottom w:w="0" w:type="dxa"/>
-              <w:end w:w="0" w:type="dxa"/>
-            </w:tcMar>
+            <w:tcBorders>
+              <w:top w:val="nil"/>
+              <w:left w:val="nil"/>
+              <w:bottom w:val="nil"/>
+              <w:right w:val="nil"/>
+            </w:tcBorders>
           </w:tcPr>
           <w:p>
             <w:pPr>
-              <w:keepNext/>
-              <w:spacing w:before="0" w:after="0"/>
+              <w:spacing w:after="0"/>
               <w:jc w:val="right"/>
             </w:pPr>
             <w:r>
               <w:rPr>
-                <w:rFonts w:ascii="Times New Roman" w:hAnsi="Times New Roman"/>
-                <w:color w:val="111111"/>
-                <w:sz w:val="15"/>
+                <w:b/>
+                <w:i w:val="0"/>
+                <w:sz w:val="18"/>
               </w:rPr>
               <w:t>May 2023 - Aug 2023</w:t>
             </w:r>
@@ -1083,14 +1454,14 @@
     <w:p>
       <w:pPr>
         <w:keepNext/>
-        <w:spacing w:after="0"/>
+        <w:spacing w:after="20"/>
       </w:pPr>
       <w:r>
         <w:rPr>
-          <w:rFonts w:ascii="Times New Roman" w:hAnsi="Times New Roman"/>
+          <w:b w:val="0"/>
           <w:i/>
-          <w:color w:val="333333"/>
-          <w:sz w:val="15"/>
+          <w:color w:val="5D6864"/>
+          <w:sz w:val="17"/>
         </w:rPr>
         <w:t>Enterprise Creation Intern | Pittsburgh, PA</w:t>
       </w:r>
@@ -1098,66 +1469,98 @@
     <w:p>
       <w:pPr>
         <w:pStyle w:val="ListBullet"/>
-        <w:spacing w:after="0"/>
-        <w:ind w:left="230" w:hanging="144"/>
+        <w:keepLines/>
+        <w:spacing w:after="12" w:line="240" w:lineRule="auto"/>
+        <w:ind w:left="259" w:hanging="173"/>
       </w:pPr>
       <w:r>
         <w:rPr>
-          <w:rFonts w:ascii="Times New Roman" w:hAnsi="Times New Roman"/>
-          <w:color w:val="111111"/>
-          <w:sz w:val="15"/>
+          <w:b w:val="0"/>
+          <w:i w:val="0"/>
+          <w:sz w:val="17"/>
         </w:rPr>
-        <w:t>Conducted customer discovery and market analysis for CMU Bio-robotic Lab and Phlux, connecting technical use cases with commercialization evidence.</w:t>
+        <w:t>Built profiles for 1,000+ customers, identified 60+ high-potential leads, and connected with 26 key prospects for CMU Bio-robotic Lab market discovery.</w:t>
       </w:r>
     </w:p>
     <w:p>
       <w:pPr>
         <w:pStyle w:val="ListBullet"/>
-        <w:spacing w:after="0"/>
-        <w:ind w:left="230" w:hanging="144"/>
+        <w:keepLines/>
+        <w:spacing w:after="12" w:line="240" w:lineRule="auto"/>
+        <w:ind w:left="259" w:hanging="173"/>
       </w:pPr>
       <w:r>
         <w:rPr>
-          <w:rFonts w:ascii="Times New Roman" w:hAnsi="Times New Roman"/>
-          <w:color w:val="111111"/>
-          <w:sz w:val="15"/>
+          <w:b w:val="0"/>
+          <w:i w:val="0"/>
+          <w:sz w:val="17"/>
         </w:rPr>
-        <w:t>Built customer profiles, screened high-potential leads, and synthesized interview findings to support venture exploration and technology-transfer decisions.</w:t>
+        <w:t>Analyzed one-million-plus data points with RStudio and Excel to evaluate market potential and align technical use cases with commercialization evidence.</w:t>
+      </w:r>
+    </w:p>
+    <w:p>
+      <w:pPr>
+        <w:pStyle w:val="ListBullet"/>
+        <w:keepLines/>
+        <w:spacing w:after="12" w:line="240" w:lineRule="auto"/>
+        <w:ind w:left="259" w:hanging="173"/>
+      </w:pPr>
+      <w:r>
+        <w:rPr>
+          <w:b w:val="0"/>
+          <w:i w:val="0"/>
+          <w:sz w:val="17"/>
+        </w:rPr>
+        <w:t>Led Phlux consulting work including 20+ customer interviews to refine core use cases and market-entry assumptions.</w:t>
+      </w:r>
+    </w:p>
+    <w:p>
+      <w:pPr>
+        <w:pStyle w:val="ListBullet"/>
+        <w:keepLines/>
+        <w:spacing w:after="12" w:line="240" w:lineRule="auto"/>
+        <w:ind w:left="259" w:hanging="173"/>
+      </w:pPr>
+      <w:r>
+        <w:rPr>
+          <w:b w:val="0"/>
+          <w:i w:val="0"/>
+          <w:sz w:val="17"/>
+        </w:rPr>
+        <w:t>Defined 10+ proprietary technology use cases to support product positioning and comparative market-feedback analysis.</w:t>
       </w:r>
     </w:p>
     <w:tbl>
       <w:tblPr>
-        <w:tblW w:type="dxa" w:w="10800"/>
+        <w:tblW w:type="auto" w:w="0"/>
         <w:tblLayout w:type="fixed"/>
         <w:tblLook w:firstColumn="1" w:firstRow="1" w:lastColumn="0" w:lastRow="0" w:noHBand="0" w:noVBand="1" w:val="04A0"/>
       </w:tblPr>
       <w:tblGrid>
-        <w:gridCol w:w="8640"/>
-        <w:gridCol w:w="2160"/>
+        <w:gridCol w:w="5328"/>
+        <w:gridCol w:w="5328"/>
       </w:tblGrid>
       <w:tr>
         <w:tc>
           <w:tcPr>
-            <w:tcW w:type="dxa" w:w="8640"/>
+            <w:tcW w:type="dxa" w:w="7704"/>
             <w:vAlign w:val="center"/>
-            <w:tcMar>
-              <w:top w:w="0" w:type="dxa"/>
-              <w:start w:w="0" w:type="dxa"/>
-              <w:bottom w:w="0" w:type="dxa"/>
-              <w:end w:w="0" w:type="dxa"/>
-            </w:tcMar>
+            <w:tcBorders>
+              <w:top w:val="nil"/>
+              <w:left w:val="nil"/>
+              <w:bottom w:val="nil"/>
+              <w:right w:val="nil"/>
+            </w:tcBorders>
           </w:tcPr>
           <w:p>
             <w:pPr>
-              <w:keepNext/>
-              <w:spacing w:before="0" w:after="0"/>
+              <w:spacing w:after="0"/>
             </w:pPr>
             <w:r>
               <w:rPr>
-                <w:rFonts w:ascii="Times New Roman" w:hAnsi="Times New Roman"/>
                 <w:b/>
-                <w:color w:val="111111"/>
-                <w:sz w:val="16"/>
+                <w:i w:val="0"/>
+                <w:sz w:val="18"/>
               </w:rPr>
               <w:t>Signify (China) Investment Co., Ltd.</w:t>
             </w:r>
@@ -1165,26 +1568,25 @@
         </w:tc>
         <w:tc>
           <w:tcPr>
-            <w:tcW w:type="dxa" w:w="2160"/>
+            <w:tcW w:type="dxa" w:w="2232"/>
             <w:vAlign w:val="center"/>
-            <w:tcMar>
-              <w:top w:w="0" w:type="dxa"/>
-              <w:start w:w="0" w:type="dxa"/>
-              <w:bottom w:w="0" w:type="dxa"/>
-              <w:end w:w="0" w:type="dxa"/>
-            </w:tcMar>
+            <w:tcBorders>
+              <w:top w:val="nil"/>
+              <w:left w:val="nil"/>
+              <w:bottom w:val="nil"/>
+              <w:right w:val="nil"/>
+            </w:tcBorders>
           </w:tcPr>
           <w:p>
             <w:pPr>
-              <w:keepNext/>
-              <w:spacing w:before="0" w:after="0"/>
+              <w:spacing w:after="0"/>
               <w:jc w:val="right"/>
             </w:pPr>
             <w:r>
               <w:rPr>
-                <w:rFonts w:ascii="Times New Roman" w:hAnsi="Times New Roman"/>
-                <w:color w:val="111111"/>
-                <w:sz w:val="15"/>
+                <w:b/>
+                <w:i w:val="0"/>
+                <w:sz w:val="18"/>
               </w:rPr>
               <w:t>Sep 2022 - Dec 2022</w:t>
             </w:r>
@@ -1195,14 +1597,14 @@
     <w:p>
       <w:pPr>
         <w:keepNext/>
-        <w:spacing w:after="0"/>
+        <w:spacing w:after="20"/>
       </w:pPr>
       <w:r>
         <w:rPr>
-          <w:rFonts w:ascii="Times New Roman" w:hAnsi="Times New Roman"/>
+          <w:b w:val="0"/>
           <w:i/>
-          <w:color w:val="333333"/>
-          <w:sz w:val="15"/>
+          <w:color w:val="5D6864"/>
+          <w:sz w:val="17"/>
         </w:rPr>
         <w:t>Hardware Engineer Intern | Shanghai, China</w:t>
       </w:r>
@@ -1210,14 +1612,15 @@
     <w:p>
       <w:pPr>
         <w:pStyle w:val="ListBullet"/>
-        <w:spacing w:after="0"/>
-        <w:ind w:left="230" w:hanging="144"/>
+        <w:keepLines/>
+        <w:spacing w:after="12" w:line="240" w:lineRule="auto"/>
+        <w:ind w:left="259" w:hanging="173"/>
       </w:pPr>
       <w:r>
         <w:rPr>
-          <w:rFonts w:ascii="Times New Roman" w:hAnsi="Times New Roman"/>
-          <w:color w:val="111111"/>
-          <w:sz w:val="15"/>
+          <w:b w:val="0"/>
+          <w:i w:val="0"/>
+          <w:sz w:val="17"/>
         </w:rPr>
         <w:t>Optimized power-circuit designs with active EMI filters and high-performance capacitors, reducing power consumption by 30%.</w:t>
       </w:r>
@@ -1225,31 +1628,184 @@
     <w:p>
       <w:pPr>
         <w:pStyle w:val="ListBullet"/>
-        <w:spacing w:after="0"/>
-        <w:ind w:left="230" w:hanging="144"/>
+        <w:keepLines/>
+        <w:spacing w:after="12" w:line="240" w:lineRule="auto"/>
+        <w:ind w:left="259" w:hanging="173"/>
       </w:pPr>
       <w:r>
         <w:rPr>
-          <w:rFonts w:ascii="Times New Roman" w:hAnsi="Times New Roman"/>
-          <w:color w:val="111111"/>
-          <w:sz w:val="15"/>
+          <w:b w:val="0"/>
+          <w:i w:val="0"/>
+          <w:sz w:val="17"/>
         </w:rPr>
-        <w:t>Debugged IoT lamp control logic and testing workflows, supporting hardware validation and embedded-device troubleshooting.</w:t>
+        <w:t>Debugged and tested IoT lamp functionality, improving lighting accuracy and user response speed by refining control algorithms and response logic.</w:t>
+      </w:r>
+    </w:p>
+    <w:tbl>
+      <w:tblPr>
+        <w:tblW w:type="auto" w:w="0"/>
+        <w:tblLayout w:type="fixed"/>
+        <w:tblLook w:firstColumn="1" w:firstRow="1" w:lastColumn="0" w:lastRow="0" w:noHBand="0" w:noVBand="1" w:val="04A0"/>
+      </w:tblPr>
+      <w:tblGrid>
+        <w:gridCol w:w="5328"/>
+        <w:gridCol w:w="5328"/>
+      </w:tblGrid>
+      <w:tr>
+        <w:tc>
+          <w:tcPr>
+            <w:tcW w:type="dxa" w:w="7704"/>
+            <w:vAlign w:val="center"/>
+            <w:tcBorders>
+              <w:top w:val="nil"/>
+              <w:left w:val="nil"/>
+              <w:bottom w:val="nil"/>
+              <w:right w:val="nil"/>
+            </w:tcBorders>
+          </w:tcPr>
+          <w:p>
+            <w:pPr>
+              <w:spacing w:after="0"/>
+            </w:pPr>
+            <w:r>
+              <w:rPr>
+                <w:b/>
+                <w:i w:val="0"/>
+                <w:sz w:val="18"/>
+              </w:rPr>
+              <w:t>China Mobile Communication Group Co., Ltd.</w:t>
+            </w:r>
+          </w:p>
+        </w:tc>
+        <w:tc>
+          <w:tcPr>
+            <w:tcW w:type="dxa" w:w="2232"/>
+            <w:vAlign w:val="center"/>
+            <w:tcBorders>
+              <w:top w:val="nil"/>
+              <w:left w:val="nil"/>
+              <w:bottom w:val="nil"/>
+              <w:right w:val="nil"/>
+            </w:tcBorders>
+          </w:tcPr>
+          <w:p>
+            <w:pPr>
+              <w:spacing w:after="0"/>
+              <w:jc w:val="right"/>
+            </w:pPr>
+            <w:r>
+              <w:rPr>
+                <w:b/>
+                <w:i w:val="0"/>
+                <w:sz w:val="18"/>
+              </w:rPr>
+              <w:t>Jul 2020 - Aug 2020</w:t>
+            </w:r>
+          </w:p>
+        </w:tc>
+      </w:tr>
+    </w:tbl>
+    <w:p>
+      <w:pPr>
+        <w:keepNext/>
+        <w:spacing w:after="20"/>
+      </w:pPr>
+      <w:r>
+        <w:rPr>
+          <w:b w:val="0"/>
+          <w:i/>
+          <w:color w:val="5D6864"/>
+          <w:sz w:val="17"/>
+        </w:rPr>
+        <w:t>Engineering Maintenance Intern | Changzhou, China</w:t>
+      </w:r>
+    </w:p>
+    <w:p>
+      <w:pPr>
+        <w:pStyle w:val="ListBullet"/>
+        <w:keepLines/>
+        <w:spacing w:after="12" w:line="240" w:lineRule="auto"/>
+        <w:ind w:left="259" w:hanging="173"/>
+      </w:pPr>
+      <w:r>
+        <w:rPr>
+          <w:b w:val="0"/>
+          <w:i w:val="0"/>
+          <w:sz w:val="17"/>
+        </w:rPr>
+        <w:t>Supported planning and deployment of 10+ 5G base stations, expanding network coverage in three service areas.</w:t>
+      </w:r>
+    </w:p>
+    <w:p>
+      <w:pPr>
+        <w:pStyle w:val="ListBullet"/>
+        <w:keepLines/>
+        <w:spacing w:after="12" w:line="240" w:lineRule="auto"/>
+        <w:ind w:left="259" w:hanging="173"/>
+      </w:pPr>
+      <w:r>
+        <w:rPr>
+          <w:b w:val="0"/>
+          <w:i w:val="0"/>
+          <w:sz w:val="17"/>
+        </w:rPr>
+        <w:t>Resolved base-station issues involving signal interference, transmission delay, and energy efficiency, contributing to reduced network downtime.</w:t>
+      </w:r>
+    </w:p>
+    <w:p>
+      <w:pPr>
+        <w:pStyle w:val="ListBullet"/>
+        <w:keepLines/>
+        <w:spacing w:after="12" w:line="240" w:lineRule="auto"/>
+        <w:ind w:left="259" w:hanging="173"/>
+      </w:pPr>
+      <w:r>
+        <w:rPr>
+          <w:b w:val="0"/>
+          <w:i w:val="0"/>
+          <w:sz w:val="17"/>
+        </w:rPr>
+        <w:t>Assisted maintenance workflows for malfunctioning base stations and documented field-level troubleshooting outcomes.</w:t>
       </w:r>
     </w:p>
     <w:p>
       <w:pPr>
         <w:keepNext/>
-        <w:spacing w:before="60" w:after="20"/>
-        <w:pBdr>
-          <w:bottom w:val="single" w:sz="5" w:space="1" w:color="7A8CA3"/>
-        </w:pBdr>
+        <w:spacing w:before="120" w:after="40"/>
       </w:pPr>
       <w:r>
         <w:rPr>
-          <w:rFonts w:ascii="Times New Roman" w:hAnsi="Times New Roman"/>
           <w:b/>
-          <w:color w:val="1F4D78"/>
+          <w:i w:val="0"/>
+          <w:color w:val="1F4F4C"/>
+          <w:sz w:val="20"/>
+        </w:rPr>
+        <w:t>PUBLICATION</w:t>
+      </w:r>
+    </w:p>
+    <w:p>
+      <w:pPr>
+        <w:spacing w:after="40"/>
+      </w:pPr>
+      <w:r>
+        <w:rPr>
+          <w:b w:val="0"/>
+          <w:i w:val="0"/>
+          <w:sz w:val="17"/>
+        </w:rPr>
+        <w:t>Y. Ni and L. Shi, "Specific clustering scenarios and simple algorithm simulation in 5G environment," Proc. SPIE 12087, EIECT 2021, 120870M, 2021.</w:t>
+      </w:r>
+    </w:p>
+    <w:p>
+      <w:pPr>
+        <w:keepNext/>
+        <w:spacing w:before="120" w:after="40"/>
+      </w:pPr>
+      <w:r>
+        <w:rPr>
+          <w:b/>
+          <w:i w:val="0"/>
+          <w:color w:val="1F4F4C"/>
           <w:sz w:val="20"/>
         </w:rPr>
         <w:t>TECHNICAL SKILLS</w:t>
@@ -1261,16 +1817,16 @@
       </w:pPr>
       <w:r>
         <w:rPr>
-          <w:rFonts w:ascii="Times New Roman" w:hAnsi="Times New Roman"/>
-          <w:color w:val="111111"/>
-          <w:sz w:val="15"/>
+          <w:b w:val="0"/>
+          <w:i w:val="0"/>
+          <w:sz w:val="17"/>
         </w:rPr>
-        <w:t>Python, MATLAB, C/C++, ROS/ROS2, Linux, PCL, OpenCV, PyTorch, NumPy.</w:t>
+        <w:t>Python, MATLAB, C/C++, ROS/ROS2, Linux, PCL, OpenCV, PyTorch, NumPy, STK, NS3, LTspice, Altium Designer.</w:t>
       </w:r>
     </w:p>
     <w:sectPr>
       <w:pgSz w:w="12240" w:h="15840"/>
-      <w:pgMar w:top="475" w:right="720" w:bottom="403" w:left="720" w:header="720" w:footer="720" w:gutter="0"/>
+      <w:pgMar w:top="648" w:right="792" w:bottom="648" w:left="792" w:header="720" w:footer="720" w:gutter="0"/>
       <w:cols w:space="720"/>
       <w:docGrid w:linePitch="360"/>
     </w:sectPr>
@@ -1641,9 +2197,12 @@
     <w:name w:val="Normal"/>
     <w:qFormat/>
     <w:rsid w:val="00FC693F"/>
+    <w:pPr>
+      <w:spacing w:after="20" w:line="240" w:lineRule="auto"/>
+    </w:pPr>
     <w:rPr>
-      <w:rFonts w:ascii="Times New Roman" w:hAnsi="Times New Roman"/>
-      <w:sz w:val="15"/>
+      <w:rFonts w:ascii="Arial" w:hAnsi="Arial" w:eastAsia="Arial"/>
+      <w:sz w:val="17"/>
     </w:rPr>
   </w:style>
   <w:style w:type="paragraph" w:styleId="Header">
@@ -2175,8 +2734,8 @@
       <w:contextualSpacing/>
     </w:pPr>
     <w:rPr>
-      <w:rFonts w:ascii="Times New Roman" w:hAnsi="Times New Roman"/>
-      <w:sz w:val="15"/>
+      <w:rFonts w:ascii="Arial" w:hAnsi="Arial" w:eastAsia="Arial"/>
+      <w:sz w:val="17"/>
     </w:rPr>
   </w:style>
   <w:style w:type="paragraph" w:styleId="ListBullet2">

</xml_diff>

<commit_message>
Restyle CV with quieter format
</commit_message>
<xml_diff>
--- a/assets/Yuxuan_Ni_CV.docx
+++ b/assets/Yuxuan_Ni_CV.docx
@@ -9,42 +9,29 @@
       </w:pPr>
       <w:r>
         <w:rPr>
+          <w:rFonts w:ascii="Arial" w:hAnsi="Arial" w:eastAsia="Arial"/>
           <w:b/>
           <w:i w:val="0"/>
-          <w:color w:val="1D2524"/>
-          <w:sz w:val="32"/>
+          <w:color w:val="202020"/>
+          <w:sz w:val="27"/>
         </w:rPr>
         <w:t>Yuxuan Ni</w:t>
       </w:r>
     </w:p>
     <w:p>
       <w:pPr>
-        <w:spacing w:after="60"/>
+        <w:spacing w:after="80"/>
         <w:jc w:val="center"/>
       </w:pPr>
       <w:r>
         <w:rPr>
+          <w:rFonts w:ascii="Arial" w:hAnsi="Arial" w:eastAsia="Arial"/>
           <w:b w:val="0"/>
           <w:i w:val="0"/>
-          <w:color w:val="5D6864"/>
-          <w:sz w:val="17"/>
+          <w:color w:val="5F5F5F"/>
+          <w:sz w:val="15"/>
         </w:rPr>
         <w:t>(412) 618-9972 | yni5@crimson.ua.edu | github.com/YuxuanNi-25 | yuxuanni-25.github.io</w:t>
-      </w:r>
-    </w:p>
-    <w:p>
-      <w:pPr>
-        <w:keepNext/>
-        <w:spacing w:before="120" w:after="40"/>
-      </w:pPr>
-      <w:r>
-        <w:rPr>
-          <w:b/>
-          <w:i w:val="0"/>
-          <w:color w:val="1F4F4C"/>
-          <w:sz w:val="20"/>
-        </w:rPr>
-        <w:t>EDUCATION</w:t>
       </w:r>
     </w:p>
     <w:tbl>
@@ -54,19 +41,57 @@
         <w:tblLook w:firstColumn="1" w:firstRow="1" w:lastColumn="0" w:lastRow="0" w:noHBand="0" w:noVBand="1" w:val="04A0"/>
       </w:tblPr>
       <w:tblGrid>
-        <w:gridCol w:w="5328"/>
-        <w:gridCol w:w="5328"/>
+        <w:gridCol w:w="10296"/>
       </w:tblGrid>
       <w:tr>
         <w:tc>
           <w:tcPr>
-            <w:tcW w:type="dxa" w:w="7704"/>
+            <w:tcW w:type="dxa" w:w="10858"/>
+            <w:tcBorders>
+              <w:top w:val="nil"/>
+              <w:left w:val="nil"/>
+              <w:right w:val="nil"/>
+              <w:bottom w:val="single" w:sz="4" w:space="1" w:color="B4B4B4"/>
+            </w:tcBorders>
+          </w:tcPr>
+          <w:p>
+            <w:pPr>
+              <w:spacing w:before="60" w:after="20"/>
+            </w:pPr>
+            <w:r>
+              <w:rPr>
+                <w:rFonts w:ascii="Arial" w:hAnsi="Arial" w:eastAsia="Arial"/>
+                <w:b/>
+                <w:i w:val="0"/>
+                <w:color w:val="202020"/>
+                <w:sz w:val="15"/>
+              </w:rPr>
+              <w:t>EDUCATION</w:t>
+            </w:r>
+          </w:p>
+        </w:tc>
+      </w:tr>
+    </w:tbl>
+    <w:tbl>
+      <w:tblPr>
+        <w:tblW w:type="auto" w:w="0"/>
+        <w:tblLayout w:type="fixed"/>
+        <w:tblLook w:firstColumn="1" w:firstRow="1" w:lastColumn="0" w:lastRow="0" w:noHBand="0" w:noVBand="1" w:val="04A0"/>
+      </w:tblPr>
+      <w:tblGrid>
+        <w:gridCol w:w="5429"/>
+        <w:gridCol w:w="5429"/>
+      </w:tblGrid>
+      <w:tr>
+        <w:tc>
+          <w:tcPr>
+            <w:tcW w:type="dxa" w:w="8136"/>
             <w:vAlign w:val="center"/>
             <w:tcBorders>
               <w:top w:val="nil"/>
               <w:left w:val="nil"/>
+              <w:right w:val="nil"/>
               <w:bottom w:val="nil"/>
-              <w:right w:val="nil"/>
             </w:tcBorders>
           </w:tcPr>
           <w:p>
@@ -75,9 +100,11 @@
             </w:pPr>
             <w:r>
               <w:rPr>
+                <w:rFonts w:ascii="Arial" w:hAnsi="Arial" w:eastAsia="Arial"/>
                 <w:b/>
                 <w:i w:val="0"/>
-                <w:sz w:val="18"/>
+                <w:color w:val="202020"/>
+                <w:sz w:val="16"/>
               </w:rPr>
               <w:t>The University of Alabama</w:t>
             </w:r>
@@ -85,13 +112,13 @@
         </w:tc>
         <w:tc>
           <w:tcPr>
-            <w:tcW w:type="dxa" w:w="2232"/>
+            <w:tcW w:type="dxa" w:w="2160"/>
             <w:vAlign w:val="center"/>
             <w:tcBorders>
               <w:top w:val="nil"/>
               <w:left w:val="nil"/>
+              <w:right w:val="nil"/>
               <w:bottom w:val="nil"/>
-              <w:right w:val="nil"/>
             </w:tcBorders>
           </w:tcPr>
           <w:p>
@@ -101,9 +128,11 @@
             </w:pPr>
             <w:r>
               <w:rPr>
-                <w:b/>
+                <w:rFonts w:ascii="Arial" w:hAnsi="Arial" w:eastAsia="Arial"/>
+                <w:b w:val="0"/>
                 <w:i w:val="0"/>
-                <w:sz w:val="18"/>
+                <w:color w:val="202020"/>
+                <w:sz w:val="16"/>
               </w:rPr>
               <w:t>Sep 2025 - Present</w:t>
             </w:r>
@@ -113,13 +142,15 @@
     </w:tbl>
     <w:p>
       <w:pPr>
-        <w:spacing w:after="20"/>
+        <w:spacing w:after="10" w:line="240" w:lineRule="auto"/>
       </w:pPr>
       <w:r>
         <w:rPr>
+          <w:rFonts w:ascii="Arial" w:hAnsi="Arial" w:eastAsia="Arial"/>
           <w:b w:val="0"/>
           <w:i w:val="0"/>
-          <w:sz w:val="17"/>
+          <w:color w:val="202020"/>
+          <w:sz w:val="16"/>
         </w:rPr>
         <w:t>Ph.D., Electrical and Computer Engineering | Tuscaloosa, AL</w:t>
       </w:r>
@@ -131,19 +162,19 @@
         <w:tblLook w:firstColumn="1" w:firstRow="1" w:lastColumn="0" w:lastRow="0" w:noHBand="0" w:noVBand="1" w:val="04A0"/>
       </w:tblPr>
       <w:tblGrid>
-        <w:gridCol w:w="5328"/>
-        <w:gridCol w:w="5328"/>
+        <w:gridCol w:w="5429"/>
+        <w:gridCol w:w="5429"/>
       </w:tblGrid>
       <w:tr>
         <w:tc>
           <w:tcPr>
-            <w:tcW w:type="dxa" w:w="7704"/>
+            <w:tcW w:type="dxa" w:w="8136"/>
             <w:vAlign w:val="center"/>
             <w:tcBorders>
               <w:top w:val="nil"/>
               <w:left w:val="nil"/>
+              <w:right w:val="nil"/>
               <w:bottom w:val="nil"/>
-              <w:right w:val="nil"/>
             </w:tcBorders>
           </w:tcPr>
           <w:p>
@@ -152,9 +183,11 @@
             </w:pPr>
             <w:r>
               <w:rPr>
+                <w:rFonts w:ascii="Arial" w:hAnsi="Arial" w:eastAsia="Arial"/>
                 <w:b/>
                 <w:i w:val="0"/>
-                <w:sz w:val="18"/>
+                <w:color w:val="202020"/>
+                <w:sz w:val="16"/>
               </w:rPr>
               <w:t>Carnegie Mellon University</w:t>
             </w:r>
@@ -162,13 +195,13 @@
         </w:tc>
         <w:tc>
           <w:tcPr>
-            <w:tcW w:type="dxa" w:w="2232"/>
+            <w:tcW w:type="dxa" w:w="2160"/>
             <w:vAlign w:val="center"/>
             <w:tcBorders>
               <w:top w:val="nil"/>
               <w:left w:val="nil"/>
+              <w:right w:val="nil"/>
               <w:bottom w:val="nil"/>
-              <w:right w:val="nil"/>
             </w:tcBorders>
           </w:tcPr>
           <w:p>
@@ -178,9 +211,11 @@
             </w:pPr>
             <w:r>
               <w:rPr>
-                <w:b/>
+                <w:rFonts w:ascii="Arial" w:hAnsi="Arial" w:eastAsia="Arial"/>
+                <w:b w:val="0"/>
                 <w:i w:val="0"/>
-                <w:sz w:val="18"/>
+                <w:color w:val="202020"/>
+                <w:sz w:val="16"/>
               </w:rPr>
               <w:t>Jan 2023 - Dec 2023</w:t>
             </w:r>
@@ -190,13 +225,15 @@
     </w:tbl>
     <w:p>
       <w:pPr>
-        <w:spacing w:after="20"/>
+        <w:spacing w:after="10" w:line="240" w:lineRule="auto"/>
       </w:pPr>
       <w:r>
         <w:rPr>
+          <w:rFonts w:ascii="Arial" w:hAnsi="Arial" w:eastAsia="Arial"/>
           <w:b w:val="0"/>
           <w:i w:val="0"/>
-          <w:sz w:val="17"/>
+          <w:color w:val="202020"/>
+          <w:sz w:val="16"/>
         </w:rPr>
         <w:t>M.S. in Engineering &amp; Technology Innovation Management | Pittsburgh, PA</w:t>
       </w:r>
@@ -208,19 +245,19 @@
         <w:tblLook w:firstColumn="1" w:firstRow="1" w:lastColumn="0" w:lastRow="0" w:noHBand="0" w:noVBand="1" w:val="04A0"/>
       </w:tblPr>
       <w:tblGrid>
-        <w:gridCol w:w="5328"/>
-        <w:gridCol w:w="5328"/>
+        <w:gridCol w:w="5429"/>
+        <w:gridCol w:w="5429"/>
       </w:tblGrid>
       <w:tr>
         <w:tc>
           <w:tcPr>
-            <w:tcW w:type="dxa" w:w="7704"/>
+            <w:tcW w:type="dxa" w:w="8136"/>
             <w:vAlign w:val="center"/>
             <w:tcBorders>
               <w:top w:val="nil"/>
               <w:left w:val="nil"/>
+              <w:right w:val="nil"/>
               <w:bottom w:val="nil"/>
-              <w:right w:val="nil"/>
             </w:tcBorders>
           </w:tcPr>
           <w:p>
@@ -229,9 +266,11 @@
             </w:pPr>
             <w:r>
               <w:rPr>
+                <w:rFonts w:ascii="Arial" w:hAnsi="Arial" w:eastAsia="Arial"/>
                 <w:b/>
                 <w:i w:val="0"/>
-                <w:sz w:val="18"/>
+                <w:color w:val="202020"/>
+                <w:sz w:val="16"/>
               </w:rPr>
               <w:t>UESTC / University of Glasgow</w:t>
             </w:r>
@@ -239,13 +278,13 @@
         </w:tc>
         <w:tc>
           <w:tcPr>
-            <w:tcW w:type="dxa" w:w="2232"/>
+            <w:tcW w:type="dxa" w:w="2160"/>
             <w:vAlign w:val="center"/>
             <w:tcBorders>
               <w:top w:val="nil"/>
               <w:left w:val="nil"/>
+              <w:right w:val="nil"/>
               <w:bottom w:val="nil"/>
-              <w:right w:val="nil"/>
             </w:tcBorders>
           </w:tcPr>
           <w:p>
@@ -255,9 +294,11 @@
             </w:pPr>
             <w:r>
               <w:rPr>
-                <w:b/>
+                <w:rFonts w:ascii="Arial" w:hAnsi="Arial" w:eastAsia="Arial"/>
+                <w:b w:val="0"/>
                 <w:i w:val="0"/>
-                <w:sz w:val="18"/>
+                <w:color w:val="202020"/>
+                <w:sz w:val="16"/>
               </w:rPr>
               <w:t>Sep 2018 - Jun 2022</w:t>
             </w:r>
@@ -267,30 +308,17 @@
     </w:tbl>
     <w:p>
       <w:pPr>
-        <w:spacing w:after="20"/>
+        <w:spacing w:after="10" w:line="240" w:lineRule="auto"/>
       </w:pPr>
       <w:r>
         <w:rPr>
+          <w:rFonts w:ascii="Arial" w:hAnsi="Arial" w:eastAsia="Arial"/>
           <w:b w:val="0"/>
           <w:i w:val="0"/>
-          <w:sz w:val="17"/>
+          <w:color w:val="202020"/>
+          <w:sz w:val="16"/>
         </w:rPr>
         <w:t>B.E. in Communication Engineering; B.E. in Electronics and Electrical Engineering with Communications</w:t>
-      </w:r>
-    </w:p>
-    <w:p>
-      <w:pPr>
-        <w:keepNext/>
-        <w:spacing w:before="120" w:after="40"/>
-      </w:pPr>
-      <w:r>
-        <w:rPr>
-          <w:b/>
-          <w:i w:val="0"/>
-          <w:color w:val="1F4F4C"/>
-          <w:sz w:val="20"/>
-        </w:rPr>
-        <w:t>SELECTED RESEARCH PROJECTS</w:t>
       </w:r>
     </w:p>
     <w:tbl>
@@ -300,19 +328,57 @@
         <w:tblLook w:firstColumn="1" w:firstRow="1" w:lastColumn="0" w:lastRow="0" w:noHBand="0" w:noVBand="1" w:val="04A0"/>
       </w:tblPr>
       <w:tblGrid>
-        <w:gridCol w:w="5328"/>
-        <w:gridCol w:w="5328"/>
+        <w:gridCol w:w="10296"/>
       </w:tblGrid>
       <w:tr>
         <w:tc>
           <w:tcPr>
-            <w:tcW w:type="dxa" w:w="7704"/>
+            <w:tcW w:type="dxa" w:w="10858"/>
+            <w:tcBorders>
+              <w:top w:val="nil"/>
+              <w:left w:val="nil"/>
+              <w:right w:val="nil"/>
+              <w:bottom w:val="single" w:sz="4" w:space="1" w:color="B4B4B4"/>
+            </w:tcBorders>
+          </w:tcPr>
+          <w:p>
+            <w:pPr>
+              <w:spacing w:before="60" w:after="20"/>
+            </w:pPr>
+            <w:r>
+              <w:rPr>
+                <w:rFonts w:ascii="Arial" w:hAnsi="Arial" w:eastAsia="Arial"/>
+                <w:b/>
+                <w:i w:val="0"/>
+                <w:color w:val="202020"/>
+                <w:sz w:val="15"/>
+              </w:rPr>
+              <w:t>SELECTED RESEARCH PROJECTS</w:t>
+            </w:r>
+          </w:p>
+        </w:tc>
+      </w:tr>
+    </w:tbl>
+    <w:tbl>
+      <w:tblPr>
+        <w:tblW w:type="auto" w:w="0"/>
+        <w:tblLayout w:type="fixed"/>
+        <w:tblLook w:firstColumn="1" w:firstRow="1" w:lastColumn="0" w:lastRow="0" w:noHBand="0" w:noVBand="1" w:val="04A0"/>
+      </w:tblPr>
+      <w:tblGrid>
+        <w:gridCol w:w="5429"/>
+        <w:gridCol w:w="5429"/>
+      </w:tblGrid>
+      <w:tr>
+        <w:tc>
+          <w:tcPr>
+            <w:tcW w:type="dxa" w:w="8136"/>
             <w:vAlign w:val="center"/>
             <w:tcBorders>
               <w:top w:val="nil"/>
               <w:left w:val="nil"/>
+              <w:right w:val="nil"/>
               <w:bottom w:val="nil"/>
-              <w:right w:val="nil"/>
             </w:tcBorders>
           </w:tcPr>
           <w:p>
@@ -321,9 +387,11 @@
             </w:pPr>
             <w:r>
               <w:rPr>
+                <w:rFonts w:ascii="Arial" w:hAnsi="Arial" w:eastAsia="Arial"/>
                 <w:b/>
                 <w:i w:val="0"/>
-                <w:sz w:val="18"/>
+                <w:color w:val="202020"/>
+                <w:sz w:val="16"/>
               </w:rPr>
               <w:t>Bunker Multi-Sensor SLAM, Localization, and Mapping</w:t>
             </w:r>
@@ -331,13 +399,13 @@
         </w:tc>
         <w:tc>
           <w:tcPr>
-            <w:tcW w:type="dxa" w:w="2232"/>
+            <w:tcW w:type="dxa" w:w="2160"/>
             <w:vAlign w:val="center"/>
             <w:tcBorders>
               <w:top w:val="nil"/>
               <w:left w:val="nil"/>
+              <w:right w:val="nil"/>
               <w:bottom w:val="nil"/>
-              <w:right w:val="nil"/>
             </w:tcBorders>
           </w:tcPr>
           <w:p>
@@ -347,9 +415,11 @@
             </w:pPr>
             <w:r>
               <w:rPr>
-                <w:b/>
+                <w:rFonts w:ascii="Arial" w:hAnsi="Arial" w:eastAsia="Arial"/>
+                <w:b w:val="0"/>
                 <w:i w:val="0"/>
-                <w:sz w:val="18"/>
+                <w:color w:val="202020"/>
+                <w:sz w:val="16"/>
               </w:rPr>
               <w:t>Aug 2025 - Present</w:t>
             </w:r>
@@ -360,80 +430,89 @@
     <w:p>
       <w:pPr>
         <w:keepNext/>
-        <w:spacing w:after="20"/>
+        <w:spacing w:after="10"/>
       </w:pPr>
       <w:r>
         <w:rPr>
+          <w:rFonts w:ascii="Arial" w:hAnsi="Arial" w:eastAsia="Arial"/>
           <w:b w:val="0"/>
-          <w:i/>
-          <w:color w:val="5D6864"/>
-          <w:sz w:val="17"/>
+          <w:i w:val="0"/>
+          <w:color w:val="5F5F5F"/>
+          <w:sz w:val="15"/>
         </w:rPr>
-        <w:t>Research Project | Prof. Shunqiao Sun and Prof. Igal Bilik | The University of Alabama / Ben-Gurion University</w:t>
+        <w:t>Research project | Prof. Shunqiao Sun and Prof. Igal Bilik | The University of Alabama / Ben-Gurion University</w:t>
       </w:r>
     </w:p>
     <w:p>
       <w:pPr>
         <w:pStyle w:val="ListBullet"/>
         <w:keepLines/>
-        <w:spacing w:after="12" w:line="240" w:lineRule="auto"/>
-        <w:ind w:left="259" w:hanging="173"/>
+        <w:spacing w:after="8" w:line="240" w:lineRule="auto"/>
+        <w:ind w:left="259" w:hanging="158"/>
       </w:pPr>
       <w:r>
         <w:rPr>
+          <w:rFonts w:ascii="Arial" w:hAnsi="Arial" w:eastAsia="Arial"/>
           <w:b w:val="0"/>
           <w:i w:val="0"/>
-          <w:sz w:val="17"/>
+          <w:color w:val="202020"/>
+          <w:sz w:val="16"/>
         </w:rPr>
-        <w:t>Built a ROS2-based UGV perception and evaluation stack for bunker, low-light, and GNSS-degraded field runs, synchronizing camera, LiDAR, 4D radar, INS/RTK, wheel feedback, and driver-control data.</w:t>
+        <w:t>Built and maintained a ROS2 UGV pipeline for synchronized camera, LiDAR, 4D radar, INS/RTK, wheel-feedback, and driver-control data in bunker, low-light, and GNSS-degraded runs.</w:t>
       </w:r>
     </w:p>
     <w:p>
       <w:pPr>
         <w:pStyle w:val="ListBullet"/>
         <w:keepLines/>
-        <w:spacing w:after="12" w:line="240" w:lineRule="auto"/>
-        <w:ind w:left="259" w:hanging="173"/>
+        <w:spacing w:after="8" w:line="240" w:lineRule="auto"/>
+        <w:ind w:left="259" w:hanging="158"/>
       </w:pPr>
       <w:r>
         <w:rPr>
+          <w:rFonts w:ascii="Arial" w:hAnsi="Arial" w:eastAsia="Arial"/>
           <w:b w:val="0"/>
           <w:i w:val="0"/>
-          <w:sz w:val="17"/>
+          <w:color w:val="202020"/>
+          <w:sz w:val="16"/>
         </w:rPr>
-        <w:t>Developed real-time LiDAR localization and soft-anchor mapping workflows; reduced a 459.5M-point raw scan stream to a 2.13M-point map (99.5% reduction) and cleaned a 24.29M-point map to 13.56M points.</w:t>
+        <w:t>Filtered large LiDAR scans for map construction and real-time localization; reduced a 459.5M-point raw scan stream to a 2.13M-point map and cleaned a 24.29M-point map to 13.56M points.</w:t>
       </w:r>
     </w:p>
     <w:p>
       <w:pPr>
         <w:pStyle w:val="ListBullet"/>
         <w:keepLines/>
-        <w:spacing w:after="12" w:line="240" w:lineRule="auto"/>
-        <w:ind w:left="259" w:hanging="173"/>
+        <w:spacing w:after="8" w:line="240" w:lineRule="auto"/>
+        <w:ind w:left="259" w:hanging="158"/>
       </w:pPr>
       <w:r>
         <w:rPr>
+          <w:rFonts w:ascii="Arial" w:hAnsi="Arial" w:eastAsia="Arial"/>
           <w:b w:val="0"/>
           <w:i w:val="0"/>
-          <w:sz w:val="17"/>
+          <w:color w:val="202020"/>
+          <w:sz w:val="16"/>
         </w:rPr>
-        <w:t>Improved radar localization through IMU-aided fusion and sensor-specific tuning, using INS/RTK alignment as the reference for trajectory evaluation and failure-case analysis.</w:t>
+        <w:t>Tested radar/IMU fusion and sensor-specific localization settings against INS/RTK references for trajectory evaluation.</w:t>
       </w:r>
     </w:p>
     <w:p>
       <w:pPr>
         <w:pStyle w:val="ListBullet"/>
         <w:keepLines/>
-        <w:spacing w:after="12" w:line="240" w:lineRule="auto"/>
-        <w:ind w:left="259" w:hanging="173"/>
+        <w:spacing w:after="8" w:line="240" w:lineRule="auto"/>
+        <w:ind w:left="259" w:hanging="158"/>
       </w:pPr>
       <w:r>
         <w:rPr>
+          <w:rFonts w:ascii="Arial" w:hAnsi="Arial" w:eastAsia="Arial"/>
           <w:b w:val="0"/>
           <w:i w:val="0"/>
-          <w:sz w:val="17"/>
+          <w:color w:val="202020"/>
+          <w:sz w:val="16"/>
         </w:rPr>
-        <w:t>Evaluated radar, visual, and LiDAR-inertial localization in a low-light, building-occluded sequence; radar odometry reached 7.16 m ATE RMSE versus 35.47 m for visual SLAM and 35.57 m for a LiDAR-inertial baseline.</w:t>
+        <w:t>Compared radar, visual, and LiDAR-inertial localization in a low-light, building-occluded sequence; radar odometry reached 7.16 m ATE RMSE in that run.</w:t>
       </w:r>
     </w:p>
     <w:tbl>
@@ -443,19 +522,19 @@
         <w:tblLook w:firstColumn="1" w:firstRow="1" w:lastColumn="0" w:lastRow="0" w:noHBand="0" w:noVBand="1" w:val="04A0"/>
       </w:tblPr>
       <w:tblGrid>
-        <w:gridCol w:w="5328"/>
-        <w:gridCol w:w="5328"/>
+        <w:gridCol w:w="5429"/>
+        <w:gridCol w:w="5429"/>
       </w:tblGrid>
       <w:tr>
         <w:tc>
           <w:tcPr>
-            <w:tcW w:type="dxa" w:w="7704"/>
+            <w:tcW w:type="dxa" w:w="8136"/>
             <w:vAlign w:val="center"/>
             <w:tcBorders>
               <w:top w:val="nil"/>
               <w:left w:val="nil"/>
+              <w:right w:val="nil"/>
               <w:bottom w:val="nil"/>
-              <w:right w:val="nil"/>
             </w:tcBorders>
           </w:tcPr>
           <w:p>
@@ -464,9 +543,11 @@
             </w:pPr>
             <w:r>
               <w:rPr>
+                <w:rFonts w:ascii="Arial" w:hAnsi="Arial" w:eastAsia="Arial"/>
                 <w:b/>
                 <w:i w:val="0"/>
-                <w:sz w:val="18"/>
+                <w:color w:val="202020"/>
+                <w:sz w:val="16"/>
               </w:rPr>
               <w:t>Learning-Based 4D Radar Odometry and Camera Fusion</w:t>
             </w:r>
@@ -474,13 +555,13 @@
         </w:tc>
         <w:tc>
           <w:tcPr>
-            <w:tcW w:type="dxa" w:w="2232"/>
+            <w:tcW w:type="dxa" w:w="2160"/>
             <w:vAlign w:val="center"/>
             <w:tcBorders>
               <w:top w:val="nil"/>
               <w:left w:val="nil"/>
+              <w:right w:val="nil"/>
               <w:bottom w:val="nil"/>
-              <w:right w:val="nil"/>
             </w:tcBorders>
           </w:tcPr>
           <w:p>
@@ -490,9 +571,11 @@
             </w:pPr>
             <w:r>
               <w:rPr>
-                <w:b/>
+                <w:rFonts w:ascii="Arial" w:hAnsi="Arial" w:eastAsia="Arial"/>
+                <w:b w:val="0"/>
                 <w:i w:val="0"/>
-                <w:sz w:val="18"/>
+                <w:color w:val="202020"/>
+                <w:sz w:val="16"/>
               </w:rPr>
               <w:t>Jan 2026 - Present</w:t>
             </w:r>
@@ -503,80 +586,89 @@
     <w:p>
       <w:pPr>
         <w:keepNext/>
-        <w:spacing w:after="20"/>
+        <w:spacing w:after="10"/>
       </w:pPr>
       <w:r>
         <w:rPr>
+          <w:rFonts w:ascii="Arial" w:hAnsi="Arial" w:eastAsia="Arial"/>
           <w:b w:val="0"/>
-          <w:i/>
-          <w:color w:val="5D6864"/>
-          <w:sz w:val="17"/>
+          <w:i w:val="0"/>
+          <w:color w:val="5F5F5F"/>
+          <w:sz w:val="15"/>
         </w:rPr>
-        <w:t>Research Project | Prof. Shunqiao Sun | The University of Alabama</w:t>
+        <w:t>Research project | Prof. Shunqiao Sun | The University of Alabama</w:t>
       </w:r>
     </w:p>
     <w:p>
       <w:pPr>
         <w:pStyle w:val="ListBullet"/>
         <w:keepLines/>
-        <w:spacing w:after="12" w:line="240" w:lineRule="auto"/>
-        <w:ind w:left="259" w:hanging="173"/>
+        <w:spacing w:after="8" w:line="240" w:lineRule="auto"/>
+        <w:ind w:left="259" w:hanging="158"/>
       </w:pPr>
       <w:r>
         <w:rPr>
+          <w:rFonts w:ascii="Arial" w:hAnsi="Arial" w:eastAsia="Arial"/>
           <w:b w:val="0"/>
           <w:i w:val="0"/>
-          <w:sz w:val="17"/>
+          <w:color w:val="202020"/>
+          <w:sz w:val="16"/>
         </w:rPr>
-        <w:t>Extended a learning-based 4D radar odometry pipeline for sparse radar point clouds, adding range/intensity pre-filtering and point-multiplication experiments to improve usable geometric structure before pose estimation.</w:t>
+        <w:t>Extended a learning-based radar odometry codebase for sparse 4D radar point clouds, focusing on controlled module-level experiments.</w:t>
       </w:r>
     </w:p>
     <w:p>
       <w:pPr>
         <w:pStyle w:val="ListBullet"/>
         <w:keepLines/>
-        <w:spacing w:after="12" w:line="240" w:lineRule="auto"/>
-        <w:ind w:left="259" w:hanging="173"/>
+        <w:spacing w:after="8" w:line="240" w:lineRule="auto"/>
+        <w:ind w:left="259" w:hanging="158"/>
       </w:pPr>
       <w:r>
         <w:rPr>
+          <w:rFonts w:ascii="Arial" w:hAnsi="Arial" w:eastAsia="Arial"/>
           <w:b w:val="0"/>
           <w:i w:val="0"/>
-          <w:sz w:val="17"/>
+          <w:color w:val="202020"/>
+          <w:sz w:val="16"/>
         </w:rPr>
-        <w:t>Built two-stage odometry experiments that first stabilize radar pose outputs and then evaluate camera-pose fusion, including an MLP-based module for combining camera estimates with radar trajectories.</w:t>
+        <w:t>Tested range/intensity filtering, point multiplication, and camera-pose fusion while keeping the pose backbone fixed for comparison.</w:t>
       </w:r>
     </w:p>
     <w:p>
       <w:pPr>
         <w:pStyle w:val="ListBullet"/>
         <w:keepLines/>
-        <w:spacing w:after="12" w:line="240" w:lineRule="auto"/>
-        <w:ind w:left="259" w:hanging="173"/>
+        <w:spacing w:after="8" w:line="240" w:lineRule="auto"/>
+        <w:ind w:left="259" w:hanging="158"/>
       </w:pPr>
       <w:r>
         <w:rPr>
+          <w:rFonts w:ascii="Arial" w:hAnsi="Arial" w:eastAsia="Arial"/>
           <w:b w:val="0"/>
           <w:i w:val="0"/>
-          <w:sz w:val="17"/>
+          <w:color w:val="202020"/>
+          <w:sz w:val="16"/>
         </w:rPr>
-        <w:t>Added lightweight pseudo-correspondence supervision while preserving the original pose backbone; introduced 84.1K trainable parameters, about 0.53% of the full model, for correspondence and offset learning.</w:t>
+        <w:t>Added a small pseudo-correspondence head with 84.1K trainable parameters, about 0.53% of the full model.</w:t>
       </w:r>
     </w:p>
     <w:p>
       <w:pPr>
         <w:pStyle w:val="ListBullet"/>
         <w:keepLines/>
-        <w:spacing w:after="12" w:line="240" w:lineRule="auto"/>
-        <w:ind w:left="259" w:hanging="173"/>
+        <w:spacing w:after="8" w:line="240" w:lineRule="auto"/>
+        <w:ind w:left="259" w:hanging="158"/>
       </w:pPr>
       <w:r>
         <w:rPr>
+          <w:rFonts w:ascii="Arial" w:hAnsi="Arial" w:eastAsia="Arial"/>
           <w:b w:val="0"/>
           <w:i w:val="0"/>
-          <w:sz w:val="17"/>
+          <w:color w:val="202020"/>
+          <w:sz w:val="16"/>
         </w:rPr>
-        <w:t>Reduced correspondence loss by 36.0%, match/static losses by about 36.8%, and offset error from 0.409 m to 0.363 m in frozen-backbone ablations; guarded refinement reduced translation RMSE from 0.752 m to 0.311 m.</w:t>
+        <w:t>In frozen-backbone ablations, reduced correspondence-related losses by about 36% and offset error from 0.409 m to 0.363 m; guarded refinement reduced translation RMSE from 0.752 m to 0.311 m.</w:t>
       </w:r>
     </w:p>
     <w:tbl>
@@ -586,19 +678,19 @@
         <w:tblLook w:firstColumn="1" w:firstRow="1" w:lastColumn="0" w:lastRow="0" w:noHBand="0" w:noVBand="1" w:val="04A0"/>
       </w:tblPr>
       <w:tblGrid>
-        <w:gridCol w:w="5328"/>
-        <w:gridCol w:w="5328"/>
+        <w:gridCol w:w="5429"/>
+        <w:gridCol w:w="5429"/>
       </w:tblGrid>
       <w:tr>
         <w:tc>
           <w:tcPr>
-            <w:tcW w:type="dxa" w:w="7704"/>
+            <w:tcW w:type="dxa" w:w="8136"/>
             <w:vAlign w:val="center"/>
             <w:tcBorders>
               <w:top w:val="nil"/>
               <w:left w:val="nil"/>
+              <w:right w:val="nil"/>
               <w:bottom w:val="nil"/>
-              <w:right w:val="nil"/>
             </w:tcBorders>
           </w:tcPr>
           <w:p>
@@ -607,9 +699,11 @@
             </w:pPr>
             <w:r>
               <w:rPr>
+                <w:rFonts w:ascii="Arial" w:hAnsi="Arial" w:eastAsia="Arial"/>
                 <w:b/>
                 <w:i w:val="0"/>
-                <w:sz w:val="18"/>
+                <w:color w:val="202020"/>
+                <w:sz w:val="16"/>
               </w:rPr>
               <w:t>NXP Radar DDM Decoding</w:t>
             </w:r>
@@ -617,13 +711,13 @@
         </w:tc>
         <w:tc>
           <w:tcPr>
-            <w:tcW w:type="dxa" w:w="2232"/>
+            <w:tcW w:type="dxa" w:w="2160"/>
             <w:vAlign w:val="center"/>
             <w:tcBorders>
               <w:top w:val="nil"/>
               <w:left w:val="nil"/>
+              <w:right w:val="nil"/>
               <w:bottom w:val="nil"/>
-              <w:right w:val="nil"/>
             </w:tcBorders>
           </w:tcPr>
           <w:p>
@@ -633,9 +727,11 @@
             </w:pPr>
             <w:r>
               <w:rPr>
-                <w:b/>
+                <w:rFonts w:ascii="Arial" w:hAnsi="Arial" w:eastAsia="Arial"/>
+                <w:b w:val="0"/>
                 <w:i w:val="0"/>
-                <w:sz w:val="18"/>
+                <w:color w:val="202020"/>
+                <w:sz w:val="16"/>
               </w:rPr>
               <w:t>Aug 2025 - Present</w:t>
             </w:r>
@@ -646,14 +742,15 @@
     <w:p>
       <w:pPr>
         <w:keepNext/>
-        <w:spacing w:after="20"/>
+        <w:spacing w:after="10"/>
       </w:pPr>
       <w:r>
         <w:rPr>
+          <w:rFonts w:ascii="Arial" w:hAnsi="Arial" w:eastAsia="Arial"/>
           <w:b w:val="0"/>
-          <w:i/>
-          <w:color w:val="5D6864"/>
-          <w:sz w:val="17"/>
+          <w:i w:val="0"/>
+          <w:color w:val="5F5F5F"/>
+          <w:sz w:val="15"/>
         </w:rPr>
         <w:t>Collaborative radar signal-processing project</w:t>
       </w:r>
@@ -662,63 +759,54 @@
       <w:pPr>
         <w:pStyle w:val="ListBullet"/>
         <w:keepLines/>
-        <w:spacing w:after="12" w:line="240" w:lineRule="auto"/>
-        <w:ind w:left="259" w:hanging="173"/>
+        <w:spacing w:after="8" w:line="240" w:lineRule="auto"/>
+        <w:ind w:left="259" w:hanging="158"/>
       </w:pPr>
       <w:r>
         <w:rPr>
+          <w:rFonts w:ascii="Arial" w:hAnsi="Arial" w:eastAsia="Arial"/>
           <w:b w:val="0"/>
           <w:i w:val="0"/>
-          <w:sz w:val="17"/>
+          <w:color w:val="202020"/>
+          <w:sz w:val="16"/>
         </w:rPr>
-        <w:t>Developed a MATLAB SFW/DDM simulation and decoding pipeline for 12-TX/12-RX, 1024-sample, 512-chirp radar data with multi-TX de-spreading and range-Doppler fusion.</w:t>
+        <w:t>Implemented a MATLAB SFW/DDM simulation and decoding workflow for 12-TX/12-RX, 1024-sample, 512-chirp radar data.</w:t>
       </w:r>
     </w:p>
     <w:p>
       <w:pPr>
         <w:pStyle w:val="ListBullet"/>
         <w:keepLines/>
-        <w:spacing w:after="12" w:line="240" w:lineRule="auto"/>
-        <w:ind w:left="259" w:hanging="173"/>
+        <w:spacing w:after="8" w:line="240" w:lineRule="auto"/>
+        <w:ind w:left="259" w:hanging="158"/>
       </w:pPr>
       <w:r>
         <w:rPr>
+          <w:rFonts w:ascii="Arial" w:hAnsi="Arial" w:eastAsia="Arial"/>
           <w:b w:val="0"/>
           <w:i w:val="0"/>
-          <w:sz w:val="17"/>
+          <w:color w:val="202020"/>
+          <w:sz w:val="16"/>
         </w:rPr>
-        <w:t>Implemented CA-CFAR and DBSCAN-based target extraction to separate DDM ghost artifacts, SFW Doppler offsets, and velocity-induced Doppler smearing in staged validation scenarios.</w:t>
+        <w:t>Added multi-TX de-spreading, range-Doppler fusion, CA-CFAR, and DBSCAN steps for staged target extraction tests.</w:t>
       </w:r>
     </w:p>
     <w:p>
       <w:pPr>
         <w:pStyle w:val="ListBullet"/>
         <w:keepLines/>
-        <w:spacing w:after="12" w:line="240" w:lineRule="auto"/>
-        <w:ind w:left="259" w:hanging="173"/>
+        <w:spacing w:after="8" w:line="240" w:lineRule="auto"/>
+        <w:ind w:left="259" w:hanging="158"/>
       </w:pPr>
       <w:r>
         <w:rPr>
+          <w:rFonts w:ascii="Arial" w:hAnsi="Arial" w:eastAsia="Arial"/>
           <w:b w:val="0"/>
           <w:i w:val="0"/>
-          <w:sz w:val="17"/>
+          <w:color w:val="202020"/>
+          <w:sz w:val="16"/>
         </w:rPr>
-        <w:t>Designed velocity-search and quadratic phase-correction desmearing, validating a 320-candidate search on close targets with 2 m range separation and 40 m/s velocity difference.</w:t>
-      </w:r>
-    </w:p>
-    <w:p>
-      <w:pPr>
-        <w:keepNext/>
-        <w:spacing w:before="120" w:after="40"/>
-      </w:pPr>
-      <w:r>
-        <w:rPr>
-          <w:b/>
-          <w:i w:val="0"/>
-          <w:color w:val="1F4F4C"/>
-          <w:sz w:val="20"/>
-        </w:rPr>
-        <w:t>PRIOR RESEARCH EXPERIENCE</w:t>
+        <w:t>Tested velocity search and quadratic phase-correction desmearing on close-target cases with 2 m range separation and 40 m/s velocity difference.</w:t>
       </w:r>
     </w:p>
     <w:tbl>
@@ -728,19 +816,57 @@
         <w:tblLook w:firstColumn="1" w:firstRow="1" w:lastColumn="0" w:lastRow="0" w:noHBand="0" w:noVBand="1" w:val="04A0"/>
       </w:tblPr>
       <w:tblGrid>
-        <w:gridCol w:w="5328"/>
-        <w:gridCol w:w="5328"/>
+        <w:gridCol w:w="10296"/>
       </w:tblGrid>
       <w:tr>
         <w:tc>
           <w:tcPr>
-            <w:tcW w:type="dxa" w:w="7704"/>
+            <w:tcW w:type="dxa" w:w="10858"/>
+            <w:tcBorders>
+              <w:top w:val="nil"/>
+              <w:left w:val="nil"/>
+              <w:right w:val="nil"/>
+              <w:bottom w:val="single" w:sz="4" w:space="1" w:color="B4B4B4"/>
+            </w:tcBorders>
+          </w:tcPr>
+          <w:p>
+            <w:pPr>
+              <w:spacing w:before="60" w:after="20"/>
+            </w:pPr>
+            <w:r>
+              <w:rPr>
+                <w:rFonts w:ascii="Arial" w:hAnsi="Arial" w:eastAsia="Arial"/>
+                <w:b/>
+                <w:i w:val="0"/>
+                <w:color w:val="202020"/>
+                <w:sz w:val="15"/>
+              </w:rPr>
+              <w:t>PRIOR RESEARCH EXPERIENCE</w:t>
+            </w:r>
+          </w:p>
+        </w:tc>
+      </w:tr>
+    </w:tbl>
+    <w:tbl>
+      <w:tblPr>
+        <w:tblW w:type="auto" w:w="0"/>
+        <w:tblLayout w:type="fixed"/>
+        <w:tblLook w:firstColumn="1" w:firstRow="1" w:lastColumn="0" w:lastRow="0" w:noHBand="0" w:noVBand="1" w:val="04A0"/>
+      </w:tblPr>
+      <w:tblGrid>
+        <w:gridCol w:w="5429"/>
+        <w:gridCol w:w="5429"/>
+      </w:tblGrid>
+      <w:tr>
+        <w:tc>
+          <w:tcPr>
+            <w:tcW w:type="dxa" w:w="8136"/>
             <w:vAlign w:val="center"/>
             <w:tcBorders>
               <w:top w:val="nil"/>
               <w:left w:val="nil"/>
+              <w:right w:val="nil"/>
               <w:bottom w:val="nil"/>
-              <w:right w:val="nil"/>
             </w:tcBorders>
           </w:tcPr>
           <w:p>
@@ -749,9 +875,11 @@
             </w:pPr>
             <w:r>
               <w:rPr>
+                <w:rFonts w:ascii="Arial" w:hAnsi="Arial" w:eastAsia="Arial"/>
                 <w:b/>
                 <w:i w:val="0"/>
-                <w:sz w:val="18"/>
+                <w:color w:val="202020"/>
+                <w:sz w:val="16"/>
               </w:rPr>
               <w:t>MVMD-Based CSP for EEG Signal Classification</w:t>
             </w:r>
@@ -759,13 +887,13 @@
         </w:tc>
         <w:tc>
           <w:tcPr>
-            <w:tcW w:type="dxa" w:w="2232"/>
+            <w:tcW w:type="dxa" w:w="2160"/>
             <w:vAlign w:val="center"/>
             <w:tcBorders>
               <w:top w:val="nil"/>
               <w:left w:val="nil"/>
+              <w:right w:val="nil"/>
               <w:bottom w:val="nil"/>
-              <w:right w:val="nil"/>
             </w:tcBorders>
           </w:tcPr>
           <w:p>
@@ -775,9 +903,11 @@
             </w:pPr>
             <w:r>
               <w:rPr>
-                <w:b/>
+                <w:rFonts w:ascii="Arial" w:hAnsi="Arial" w:eastAsia="Arial"/>
+                <w:b w:val="0"/>
                 <w:i w:val="0"/>
-                <w:sz w:val="18"/>
+                <w:color w:val="202020"/>
+                <w:sz w:val="16"/>
               </w:rPr>
               <w:t>Jun 2024 - Feb 2025</w:t>
             </w:r>
@@ -788,80 +918,71 @@
     <w:p>
       <w:pPr>
         <w:keepNext/>
-        <w:spacing w:after="20"/>
+        <w:spacing w:after="10"/>
       </w:pPr>
       <w:r>
         <w:rPr>
+          <w:rFonts w:ascii="Arial" w:hAnsi="Arial" w:eastAsia="Arial"/>
           <w:b w:val="0"/>
-          <w:i/>
-          <w:color w:val="5D6864"/>
-          <w:sz w:val="17"/>
+          <w:i w:val="0"/>
+          <w:color w:val="5F5F5F"/>
+          <w:sz w:val="15"/>
         </w:rPr>
-        <w:t>Research Assistant | Prof. Aimin Jiang | Hohai University</w:t>
+        <w:t>Research assistant | Prof. Aimin Jiang | Hohai University</w:t>
       </w:r>
     </w:p>
     <w:p>
       <w:pPr>
         <w:pStyle w:val="ListBullet"/>
         <w:keepLines/>
-        <w:spacing w:after="12" w:line="240" w:lineRule="auto"/>
-        <w:ind w:left="259" w:hanging="173"/>
+        <w:spacing w:after="8" w:line="240" w:lineRule="auto"/>
+        <w:ind w:left="259" w:hanging="158"/>
       </w:pPr>
       <w:r>
         <w:rPr>
+          <w:rFonts w:ascii="Arial" w:hAnsi="Arial" w:eastAsia="Arial"/>
           <w:b w:val="0"/>
           <w:i w:val="0"/>
-          <w:sz w:val="17"/>
+          <w:color w:val="202020"/>
+          <w:sz w:val="16"/>
         </w:rPr>
-        <w:t>Applied Multivariate Variational Mode Decomposition (MVMD) across 1,000+ EEG datasets to validate inter- and intra-subject signal variability.</w:t>
+        <w:t>Applied MVMD to 1,000+ EEG datasets to study inter- and intra-subject signal variability.</w:t>
       </w:r>
     </w:p>
     <w:p>
       <w:pPr>
         <w:pStyle w:val="ListBullet"/>
         <w:keepLines/>
-        <w:spacing w:after="12" w:line="240" w:lineRule="auto"/>
-        <w:ind w:left="259" w:hanging="173"/>
+        <w:spacing w:after="8" w:line="240" w:lineRule="auto"/>
+        <w:ind w:left="259" w:hanging="158"/>
       </w:pPr>
       <w:r>
         <w:rPr>
+          <w:rFonts w:ascii="Arial" w:hAnsi="Arial" w:eastAsia="Arial"/>
           <w:b w:val="0"/>
           <w:i w:val="0"/>
-          <w:sz w:val="17"/>
+          <w:color w:val="202020"/>
+          <w:sz w:val="16"/>
         </w:rPr>
-        <w:t>Designed a Common Spatial Pattern (CSP) algorithm that improved classification accuracy by about 10%.</w:t>
+        <w:t>Built CSP/ADMM filtering experiments and compared MLP, LDA, and SVM classifiers for EEG classification.</w:t>
       </w:r>
     </w:p>
     <w:p>
       <w:pPr>
         <w:pStyle w:val="ListBullet"/>
         <w:keepLines/>
-        <w:spacing w:after="12" w:line="240" w:lineRule="auto"/>
-        <w:ind w:left="259" w:hanging="173"/>
+        <w:spacing w:after="8" w:line="240" w:lineRule="auto"/>
+        <w:ind w:left="259" w:hanging="158"/>
       </w:pPr>
       <w:r>
         <w:rPr>
+          <w:rFonts w:ascii="Arial" w:hAnsi="Arial" w:eastAsia="Arial"/>
           <w:b w:val="0"/>
           <w:i w:val="0"/>
-          <w:sz w:val="17"/>
+          <w:color w:val="202020"/>
+          <w:sz w:val="16"/>
         </w:rPr>
-        <w:t>Optimized spatial and mode filters with ADMM and reduced computational complexity by about 20%.</w:t>
-      </w:r>
-    </w:p>
-    <w:p>
-      <w:pPr>
-        <w:pStyle w:val="ListBullet"/>
-        <w:keepLines/>
-        <w:spacing w:after="12" w:line="240" w:lineRule="auto"/>
-        <w:ind w:left="259" w:hanging="173"/>
-      </w:pPr>
-      <w:r>
-        <w:rPr>
-          <w:b w:val="0"/>
-          <w:i w:val="0"/>
-          <w:sz w:val="17"/>
-        </w:rPr>
-        <w:t>Compared MLP, LDA, and SVM classifiers to validate feature robustness across EEG classification settings.</w:t>
+        <w:t>Improved classification accuracy by about 10% and reduced computational complexity by about 20% in the tested setup.</w:t>
       </w:r>
     </w:p>
     <w:tbl>
@@ -871,19 +992,19 @@
         <w:tblLook w:firstColumn="1" w:firstRow="1" w:lastColumn="0" w:lastRow="0" w:noHBand="0" w:noVBand="1" w:val="04A0"/>
       </w:tblPr>
       <w:tblGrid>
-        <w:gridCol w:w="5328"/>
-        <w:gridCol w:w="5328"/>
+        <w:gridCol w:w="5429"/>
+        <w:gridCol w:w="5429"/>
       </w:tblGrid>
       <w:tr>
         <w:tc>
           <w:tcPr>
-            <w:tcW w:type="dxa" w:w="7704"/>
+            <w:tcW w:type="dxa" w:w="8136"/>
             <w:vAlign w:val="center"/>
             <w:tcBorders>
               <w:top w:val="nil"/>
               <w:left w:val="nil"/>
+              <w:right w:val="nil"/>
               <w:bottom w:val="nil"/>
-              <w:right w:val="nil"/>
             </w:tcBorders>
           </w:tcPr>
           <w:p>
@@ -892,9 +1013,11 @@
             </w:pPr>
             <w:r>
               <w:rPr>
+                <w:rFonts w:ascii="Arial" w:hAnsi="Arial" w:eastAsia="Arial"/>
                 <w:b/>
                 <w:i w:val="0"/>
-                <w:sz w:val="18"/>
+                <w:color w:val="202020"/>
+                <w:sz w:val="16"/>
               </w:rPr>
               <w:t>NGSO Satellite In-line Interference Analysis</w:t>
             </w:r>
@@ -902,13 +1025,13 @@
         </w:tc>
         <w:tc>
           <w:tcPr>
-            <w:tcW w:type="dxa" w:w="2232"/>
+            <w:tcW w:type="dxa" w:w="2160"/>
             <w:vAlign w:val="center"/>
             <w:tcBorders>
               <w:top w:val="nil"/>
               <w:left w:val="nil"/>
+              <w:right w:val="nil"/>
               <w:bottom w:val="nil"/>
-              <w:right w:val="nil"/>
             </w:tcBorders>
           </w:tcPr>
           <w:p>
@@ -918,9 +1041,11 @@
             </w:pPr>
             <w:r>
               <w:rPr>
-                <w:b/>
+                <w:rFonts w:ascii="Arial" w:hAnsi="Arial" w:eastAsia="Arial"/>
+                <w:b w:val="0"/>
                 <w:i w:val="0"/>
-                <w:sz w:val="18"/>
+                <w:color w:val="202020"/>
+                <w:sz w:val="16"/>
               </w:rPr>
               <w:t>Aug 2023 - Jan 2024</w:t>
             </w:r>
@@ -931,80 +1056,71 @@
     <w:p>
       <w:pPr>
         <w:keepNext/>
-        <w:spacing w:after="20"/>
+        <w:spacing w:after="10"/>
       </w:pPr>
       <w:r>
         <w:rPr>
+          <w:rFonts w:ascii="Arial" w:hAnsi="Arial" w:eastAsia="Arial"/>
           <w:b w:val="0"/>
-          <w:i/>
-          <w:color w:val="5D6864"/>
-          <w:sz w:val="17"/>
+          <w:i w:val="0"/>
+          <w:color w:val="5F5F5F"/>
+          <w:sz w:val="15"/>
         </w:rPr>
-        <w:t>Research Assistant | Prof. Jon Peha and Prof. Marvin Sirbu | Carnegie Mellon University</w:t>
+        <w:t>Research assistant | Prof. Jon Peha and Prof. Marvin Sirbu | Carnegie Mellon University</w:t>
       </w:r>
     </w:p>
     <w:p>
       <w:pPr>
         <w:pStyle w:val="ListBullet"/>
         <w:keepLines/>
-        <w:spacing w:after="12" w:line="240" w:lineRule="auto"/>
-        <w:ind w:left="259" w:hanging="173"/>
+        <w:spacing w:after="8" w:line="240" w:lineRule="auto"/>
+        <w:ind w:left="259" w:hanging="158"/>
       </w:pPr>
       <w:r>
         <w:rPr>
+          <w:rFonts w:ascii="Arial" w:hAnsi="Arial" w:eastAsia="Arial"/>
           <w:b w:val="0"/>
           <w:i w:val="0"/>
-          <w:sz w:val="17"/>
+          <w:color w:val="202020"/>
+          <w:sz w:val="16"/>
         </w:rPr>
-        <w:t>Simulated satellite-ground communication links with TLE data in MATLAB and Python, processing million-scale datasets and achieving location accuracy within 1 km.</w:t>
+        <w:t>Simulated satellite-ground links with TLE data in MATLAB and Python, processing million-scale datasets.</w:t>
       </w:r>
     </w:p>
     <w:p>
       <w:pPr>
         <w:pStyle w:val="ListBullet"/>
         <w:keepLines/>
-        <w:spacing w:after="12" w:line="240" w:lineRule="auto"/>
-        <w:ind w:left="259" w:hanging="173"/>
+        <w:spacing w:after="8" w:line="240" w:lineRule="auto"/>
+        <w:ind w:left="259" w:hanging="158"/>
       </w:pPr>
       <w:r>
         <w:rPr>
+          <w:rFonts w:ascii="Arial" w:hAnsi="Arial" w:eastAsia="Arial"/>
           <w:b w:val="0"/>
           <w:i w:val="0"/>
-          <w:sz w:val="17"/>
+          <w:color w:val="202020"/>
+          <w:sz w:val="16"/>
         </w:rPr>
-        <w:t>Developed a custom simulation model to quantify in-line interference across satellite constellations under different communication protocols.</w:t>
+        <w:t>Built simulation variants for different constellation and communication-model assumptions, reducing computational cost by about 60%.</w:t>
       </w:r>
     </w:p>
     <w:p>
       <w:pPr>
         <w:pStyle w:val="ListBullet"/>
         <w:keepLines/>
-        <w:spacing w:after="12" w:line="240" w:lineRule="auto"/>
-        <w:ind w:left="259" w:hanging="173"/>
+        <w:spacing w:after="8" w:line="240" w:lineRule="auto"/>
+        <w:ind w:left="259" w:hanging="158"/>
       </w:pPr>
       <w:r>
         <w:rPr>
+          <w:rFonts w:ascii="Arial" w:hAnsi="Arial" w:eastAsia="Arial"/>
           <w:b w:val="0"/>
           <w:i w:val="0"/>
-          <w:sz w:val="17"/>
+          <w:color w:val="202020"/>
+          <w:sz w:val="16"/>
         </w:rPr>
-        <w:t>Enhanced simulation coverage for multiple satellite communication models, reducing computational cost by about 60%.</w:t>
-      </w:r>
-    </w:p>
-    <w:p>
-      <w:pPr>
-        <w:pStyle w:val="ListBullet"/>
-        <w:keepLines/>
-        <w:spacing w:after="12" w:line="240" w:lineRule="auto"/>
-        <w:ind w:left="259" w:hanging="173"/>
-      </w:pPr>
-      <w:r>
-        <w:rPr>
-          <w:b w:val="0"/>
-          <w:i w:val="0"/>
-          <w:sz w:val="17"/>
-        </w:rPr>
-        <w:t>Designed and tested an interference-avoidance algorithm that reduced estimated interference probabilities by 30%.</w:t>
+        <w:t>Tested an interference-avoidance algorithm that reduced estimated interference probability by about 30%.</w:t>
       </w:r>
     </w:p>
     <w:tbl>
@@ -1014,19 +1130,19 @@
         <w:tblLook w:firstColumn="1" w:firstRow="1" w:lastColumn="0" w:lastRow="0" w:noHBand="0" w:noVBand="1" w:val="04A0"/>
       </w:tblPr>
       <w:tblGrid>
-        <w:gridCol w:w="5328"/>
-        <w:gridCol w:w="5328"/>
+        <w:gridCol w:w="5429"/>
+        <w:gridCol w:w="5429"/>
       </w:tblGrid>
       <w:tr>
         <w:tc>
           <w:tcPr>
-            <w:tcW w:type="dxa" w:w="7704"/>
+            <w:tcW w:type="dxa" w:w="8136"/>
             <w:vAlign w:val="center"/>
             <w:tcBorders>
               <w:top w:val="nil"/>
               <w:left w:val="nil"/>
+              <w:right w:val="nil"/>
               <w:bottom w:val="nil"/>
-              <w:right w:val="nil"/>
             </w:tcBorders>
           </w:tcPr>
           <w:p>
@@ -1035,9 +1151,11 @@
             </w:pPr>
             <w:r>
               <w:rPr>
+                <w:rFonts w:ascii="Arial" w:hAnsi="Arial" w:eastAsia="Arial"/>
                 <w:b/>
                 <w:i w:val="0"/>
-                <w:sz w:val="18"/>
+                <w:color w:val="202020"/>
+                <w:sz w:val="16"/>
               </w:rPr>
               <w:t>Low-Noise Balanced Photodetector for Single Photon Detection</w:t>
             </w:r>
@@ -1045,13 +1163,13 @@
         </w:tc>
         <w:tc>
           <w:tcPr>
-            <w:tcW w:type="dxa" w:w="2232"/>
+            <w:tcW w:type="dxa" w:w="2160"/>
             <w:vAlign w:val="center"/>
             <w:tcBorders>
               <w:top w:val="nil"/>
               <w:left w:val="nil"/>
+              <w:right w:val="nil"/>
               <w:bottom w:val="nil"/>
-              <w:right w:val="nil"/>
             </w:tcBorders>
           </w:tcPr>
           <w:p>
@@ -1061,9 +1179,11 @@
             </w:pPr>
             <w:r>
               <w:rPr>
-                <w:b/>
+                <w:rFonts w:ascii="Arial" w:hAnsi="Arial" w:eastAsia="Arial"/>
+                <w:b w:val="0"/>
                 <w:i w:val="0"/>
-                <w:sz w:val="18"/>
+                <w:color w:val="202020"/>
+                <w:sz w:val="16"/>
               </w:rPr>
               <w:t>Sep 2021 - May 2022</w:t>
             </w:r>
@@ -1074,64 +1194,71 @@
     <w:p>
       <w:pPr>
         <w:keepNext/>
-        <w:spacing w:after="20"/>
+        <w:spacing w:after="10"/>
       </w:pPr>
       <w:r>
         <w:rPr>
+          <w:rFonts w:ascii="Arial" w:hAnsi="Arial" w:eastAsia="Arial"/>
           <w:b w:val="0"/>
-          <w:i/>
-          <w:color w:val="5D6864"/>
-          <w:sz w:val="17"/>
+          <w:i w:val="0"/>
+          <w:color w:val="5F5F5F"/>
+          <w:sz w:val="15"/>
         </w:rPr>
-        <w:t>Research Assistant | Prof. Yunxiang Wang | UESTC</w:t>
+        <w:t>Research assistant | Prof. Yunxiang Wang | UESTC</w:t>
       </w:r>
     </w:p>
     <w:p>
       <w:pPr>
         <w:pStyle w:val="ListBullet"/>
         <w:keepLines/>
-        <w:spacing w:after="12" w:line="240" w:lineRule="auto"/>
-        <w:ind w:left="259" w:hanging="173"/>
+        <w:spacing w:after="8" w:line="240" w:lineRule="auto"/>
+        <w:ind w:left="259" w:hanging="158"/>
       </w:pPr>
       <w:r>
         <w:rPr>
+          <w:rFonts w:ascii="Arial" w:hAnsi="Arial" w:eastAsia="Arial"/>
           <w:b w:val="0"/>
           <w:i w:val="0"/>
-          <w:sz w:val="17"/>
+          <w:color w:val="202020"/>
+          <w:sz w:val="16"/>
         </w:rPr>
-        <w:t>Reduced noise and enhanced sensitivity by integrating JFETs with photodiode circuits, targeting a 300 MHz theoretical bandwidth.</w:t>
+        <w:t>Worked on a low-noise balanced photodetector circuit using JFETs and photodiode front-end design.</w:t>
       </w:r>
     </w:p>
     <w:p>
       <w:pPr>
         <w:pStyle w:val="ListBullet"/>
         <w:keepLines/>
-        <w:spacing w:after="12" w:line="240" w:lineRule="auto"/>
-        <w:ind w:left="259" w:hanging="173"/>
+        <w:spacing w:after="8" w:line="240" w:lineRule="auto"/>
+        <w:ind w:left="259" w:hanging="158"/>
       </w:pPr>
       <w:r>
         <w:rPr>
+          <w:rFonts w:ascii="Arial" w:hAnsi="Arial" w:eastAsia="Arial"/>
           <w:b w:val="0"/>
           <w:i w:val="0"/>
-          <w:sz w:val="17"/>
+          <w:color w:val="202020"/>
+          <w:sz w:val="16"/>
         </w:rPr>
-        <w:t>Selected and integrated a differential amplifier architecture for high-speed single-photon detection circuits.</w:t>
+        <w:t>Selected a differential amplifier structure for a 300 MHz theoretical bandwidth target.</w:t>
       </w:r>
     </w:p>
     <w:p>
       <w:pPr>
         <w:pStyle w:val="ListBullet"/>
         <w:keepLines/>
-        <w:spacing w:after="12" w:line="240" w:lineRule="auto"/>
-        <w:ind w:left="259" w:hanging="173"/>
+        <w:spacing w:after="8" w:line="240" w:lineRule="auto"/>
+        <w:ind w:left="259" w:hanging="158"/>
       </w:pPr>
       <w:r>
         <w:rPr>
+          <w:rFonts w:ascii="Arial" w:hAnsi="Arial" w:eastAsia="Arial"/>
           <w:b w:val="0"/>
           <w:i w:val="0"/>
-          <w:sz w:val="17"/>
+          <w:color w:val="202020"/>
+          <w:sz w:val="16"/>
         </w:rPr>
-        <w:t>Evaluated eight LTspice circuit designs and optimized PCB layouts in Altium Designer to reduce oscillation and improve circuit performance.</w:t>
+        <w:t>Simulated eight LTspice circuit designs and revised PCB layouts in Altium Designer to reduce oscillation.</w:t>
       </w:r>
     </w:p>
     <w:tbl>
@@ -1141,19 +1268,19 @@
         <w:tblLook w:firstColumn="1" w:firstRow="1" w:lastColumn="0" w:lastRow="0" w:noHBand="0" w:noVBand="1" w:val="04A0"/>
       </w:tblPr>
       <w:tblGrid>
-        <w:gridCol w:w="5328"/>
-        <w:gridCol w:w="5328"/>
+        <w:gridCol w:w="5429"/>
+        <w:gridCol w:w="5429"/>
       </w:tblGrid>
       <w:tr>
         <w:tc>
           <w:tcPr>
-            <w:tcW w:type="dxa" w:w="7704"/>
+            <w:tcW w:type="dxa" w:w="8136"/>
             <w:vAlign w:val="center"/>
             <w:tcBorders>
               <w:top w:val="nil"/>
               <w:left w:val="nil"/>
+              <w:right w:val="nil"/>
               <w:bottom w:val="nil"/>
-              <w:right w:val="nil"/>
             </w:tcBorders>
           </w:tcPr>
           <w:p>
@@ -1162,9 +1289,11 @@
             </w:pPr>
             <w:r>
               <w:rPr>
+                <w:rFonts w:ascii="Arial" w:hAnsi="Arial" w:eastAsia="Arial"/>
                 <w:b/>
                 <w:i w:val="0"/>
-                <w:sz w:val="18"/>
+                <w:color w:val="202020"/>
+                <w:sz w:val="16"/>
               </w:rPr>
               <w:t>5G Clustering Algorithm Simulation for Ultra-Dense Networks</w:t>
             </w:r>
@@ -1172,13 +1301,13 @@
         </w:tc>
         <w:tc>
           <w:tcPr>
-            <w:tcW w:type="dxa" w:w="2232"/>
+            <w:tcW w:type="dxa" w:w="2160"/>
             <w:vAlign w:val="center"/>
             <w:tcBorders>
               <w:top w:val="nil"/>
               <w:left w:val="nil"/>
+              <w:right w:val="nil"/>
               <w:bottom w:val="nil"/>
-              <w:right w:val="nil"/>
             </w:tcBorders>
           </w:tcPr>
           <w:p>
@@ -1188,9 +1317,11 @@
             </w:pPr>
             <w:r>
               <w:rPr>
-                <w:b/>
+                <w:rFonts w:ascii="Arial" w:hAnsi="Arial" w:eastAsia="Arial"/>
+                <w:b w:val="0"/>
                 <w:i w:val="0"/>
-                <w:sz w:val="18"/>
+                <w:color w:val="202020"/>
+                <w:sz w:val="16"/>
               </w:rPr>
               <w:t>May 2021 - Oct 2021</w:t>
             </w:r>
@@ -1201,48 +1332,53 @@
     <w:p>
       <w:pPr>
         <w:keepNext/>
-        <w:spacing w:after="20"/>
+        <w:spacing w:after="10"/>
       </w:pPr>
       <w:r>
         <w:rPr>
+          <w:rFonts w:ascii="Arial" w:hAnsi="Arial" w:eastAsia="Arial"/>
           <w:b w:val="0"/>
-          <w:i/>
-          <w:color w:val="5D6864"/>
-          <w:sz w:val="17"/>
+          <w:i w:val="0"/>
+          <w:color w:val="5F5F5F"/>
+          <w:sz w:val="15"/>
         </w:rPr>
-        <w:t>Research Project | Prof. Yuwei Wang | Chinese Academy of Sciences</w:t>
+        <w:t>Research project | Prof. Yuwei Wang | Chinese Academy of Sciences</w:t>
       </w:r>
     </w:p>
     <w:p>
       <w:pPr>
         <w:pStyle w:val="ListBullet"/>
         <w:keepLines/>
-        <w:spacing w:after="12" w:line="240" w:lineRule="auto"/>
-        <w:ind w:left="259" w:hanging="173"/>
+        <w:spacing w:after="8" w:line="240" w:lineRule="auto"/>
+        <w:ind w:left="259" w:hanging="158"/>
       </w:pPr>
       <w:r>
         <w:rPr>
+          <w:rFonts w:ascii="Arial" w:hAnsi="Arial" w:eastAsia="Arial"/>
           <w:b w:val="0"/>
           <w:i w:val="0"/>
-          <w:sz w:val="17"/>
+          <w:color w:val="202020"/>
+          <w:sz w:val="16"/>
         </w:rPr>
-        <w:t>Developed a clustering algorithm for 5G ultra-dense networks using path-loss mitigation and frequency-management strategies to reduce serial interference.</w:t>
+        <w:t>Implemented a clustering algorithm for 5G ultra-dense networks using path-loss and frequency-management assumptions.</w:t>
       </w:r>
     </w:p>
     <w:p>
       <w:pPr>
         <w:pStyle w:val="ListBullet"/>
         <w:keepLines/>
-        <w:spacing w:after="12" w:line="240" w:lineRule="auto"/>
-        <w:ind w:left="259" w:hanging="173"/>
+        <w:spacing w:after="8" w:line="240" w:lineRule="auto"/>
+        <w:ind w:left="259" w:hanging="158"/>
       </w:pPr>
       <w:r>
         <w:rPr>
+          <w:rFonts w:ascii="Arial" w:hAnsi="Arial" w:eastAsia="Arial"/>
           <w:b w:val="0"/>
           <w:i w:val="0"/>
-          <w:sz w:val="17"/>
+          <w:color w:val="202020"/>
+          <w:sz w:val="16"/>
         </w:rPr>
-        <w:t>Validated the algorithm in NS3 simulations, achieving a reported 30% improvement in data reception rates.</w:t>
+        <w:t>Validated the method in NS3 simulations, with a reported 30% improvement in data reception rate.</w:t>
       </w:r>
     </w:p>
     <w:tbl>
@@ -1252,19 +1388,19 @@
         <w:tblLook w:firstColumn="1" w:firstRow="1" w:lastColumn="0" w:lastRow="0" w:noHBand="0" w:noVBand="1" w:val="04A0"/>
       </w:tblPr>
       <w:tblGrid>
-        <w:gridCol w:w="5328"/>
-        <w:gridCol w:w="5328"/>
+        <w:gridCol w:w="5429"/>
+        <w:gridCol w:w="5429"/>
       </w:tblGrid>
       <w:tr>
         <w:tc>
           <w:tcPr>
-            <w:tcW w:type="dxa" w:w="7704"/>
+            <w:tcW w:type="dxa" w:w="8136"/>
             <w:vAlign w:val="center"/>
             <w:tcBorders>
               <w:top w:val="nil"/>
               <w:left w:val="nil"/>
+              <w:right w:val="nil"/>
               <w:bottom w:val="nil"/>
-              <w:right w:val="nil"/>
             </w:tcBorders>
           </w:tcPr>
           <w:p>
@@ -1273,9 +1409,11 @@
             </w:pPr>
             <w:r>
               <w:rPr>
+                <w:rFonts w:ascii="Arial" w:hAnsi="Arial" w:eastAsia="Arial"/>
                 <w:b/>
                 <w:i w:val="0"/>
-                <w:sz w:val="18"/>
+                <w:color w:val="202020"/>
+                <w:sz w:val="16"/>
               </w:rPr>
               <w:t>Design and Construction of a Multi-Function Rover</w:t>
             </w:r>
@@ -1283,13 +1421,13 @@
         </w:tc>
         <w:tc>
           <w:tcPr>
-            <w:tcW w:type="dxa" w:w="2232"/>
+            <w:tcW w:type="dxa" w:w="2160"/>
             <w:vAlign w:val="center"/>
             <w:tcBorders>
               <w:top w:val="nil"/>
               <w:left w:val="nil"/>
+              <w:right w:val="nil"/>
               <w:bottom w:val="nil"/>
-              <w:right w:val="nil"/>
             </w:tcBorders>
           </w:tcPr>
           <w:p>
@@ -1299,9 +1437,11 @@
             </w:pPr>
             <w:r>
               <w:rPr>
-                <w:b/>
+                <w:rFonts w:ascii="Arial" w:hAnsi="Arial" w:eastAsia="Arial"/>
+                <w:b w:val="0"/>
                 <w:i w:val="0"/>
-                <w:sz w:val="18"/>
+                <w:color w:val="202020"/>
+                <w:sz w:val="16"/>
               </w:rPr>
               <w:t>Feb 2021 - Jun 2021</w:t>
             </w:r>
@@ -1312,79 +1452,71 @@
     <w:p>
       <w:pPr>
         <w:keepNext/>
-        <w:spacing w:after="20"/>
+        <w:spacing w:after="10"/>
       </w:pPr>
       <w:r>
         <w:rPr>
+          <w:rFonts w:ascii="Arial" w:hAnsi="Arial" w:eastAsia="Arial"/>
           <w:b w:val="0"/>
-          <w:i/>
-          <w:color w:val="5D6864"/>
-          <w:sz w:val="17"/>
+          <w:i w:val="0"/>
+          <w:color w:val="5F5F5F"/>
+          <w:sz w:val="15"/>
         </w:rPr>
-        <w:t>Team Project | Communication Group Lead</w:t>
+        <w:t>Team project | Communication group lead</w:t>
       </w:r>
     </w:p>
     <w:p>
       <w:pPr>
         <w:pStyle w:val="ListBullet"/>
         <w:keepLines/>
-        <w:spacing w:after="12" w:line="240" w:lineRule="auto"/>
-        <w:ind w:left="259" w:hanging="173"/>
+        <w:spacing w:after="8" w:line="240" w:lineRule="auto"/>
+        <w:ind w:left="259" w:hanging="158"/>
       </w:pPr>
       <w:r>
         <w:rPr>
+          <w:rFonts w:ascii="Arial" w:hAnsi="Arial" w:eastAsia="Arial"/>
           <w:b w:val="0"/>
           <w:i w:val="0"/>
-          <w:sz w:val="17"/>
+          <w:color w:val="202020"/>
+          <w:sz w:val="16"/>
         </w:rPr>
-        <w:t>Led development of a low-latency wireless communication system for a multifunctional rover, supporting real-time data exchange with the control center.</w:t>
+        <w:t>Led the rover communication group and built a low-latency wireless link between the rover and control center.</w:t>
       </w:r>
     </w:p>
     <w:p>
       <w:pPr>
         <w:pStyle w:val="ListBullet"/>
         <w:keepLines/>
-        <w:spacing w:after="12" w:line="240" w:lineRule="auto"/>
-        <w:ind w:left="259" w:hanging="173"/>
+        <w:spacing w:after="8" w:line="240" w:lineRule="auto"/>
+        <w:ind w:left="259" w:hanging="158"/>
       </w:pPr>
       <w:r>
         <w:rPr>
+          <w:rFonts w:ascii="Arial" w:hAnsi="Arial" w:eastAsia="Arial"/>
           <w:b w:val="0"/>
           <w:i w:val="0"/>
-          <w:sz w:val="17"/>
+          <w:color w:val="202020"/>
+          <w:sz w:val="16"/>
         </w:rPr>
-        <w:t>Implemented route tracking and color recognition functions with custom sensing and control logic, achieving over 90% navigation accuracy in project tests.</w:t>
+        <w:t>Implemented route tracking and color recognition functions with custom sensing and control logic.</w:t>
       </w:r>
     </w:p>
     <w:p>
       <w:pPr>
         <w:pStyle w:val="ListBullet"/>
         <w:keepLines/>
-        <w:spacing w:after="12" w:line="240" w:lineRule="auto"/>
-        <w:ind w:left="259" w:hanging="173"/>
+        <w:spacing w:after="8" w:line="240" w:lineRule="auto"/>
+        <w:ind w:left="259" w:hanging="158"/>
       </w:pPr>
       <w:r>
         <w:rPr>
+          <w:rFonts w:ascii="Arial" w:hAnsi="Arial" w:eastAsia="Arial"/>
           <w:b w:val="0"/>
           <w:i w:val="0"/>
-          <w:sz w:val="17"/>
+          <w:color w:val="202020"/>
+          <w:sz w:val="16"/>
         </w:rPr>
         <w:t>Coordinated embedded programming, circuit design, and communication-module integration under project schedule constraints.</w:t>
-      </w:r>
-    </w:p>
-    <w:p>
-      <w:pPr>
-        <w:keepNext/>
-        <w:spacing w:before="120" w:after="40"/>
-      </w:pPr>
-      <w:r>
-        <w:rPr>
-          <w:b/>
-          <w:i w:val="0"/>
-          <w:color w:val="1F4F4C"/>
-          <w:sz w:val="20"/>
-        </w:rPr>
-        <w:t>WORK EXPERIENCE</w:t>
       </w:r>
     </w:p>
     <w:tbl>
@@ -1394,19 +1526,57 @@
         <w:tblLook w:firstColumn="1" w:firstRow="1" w:lastColumn="0" w:lastRow="0" w:noHBand="0" w:noVBand="1" w:val="04A0"/>
       </w:tblPr>
       <w:tblGrid>
-        <w:gridCol w:w="5328"/>
-        <w:gridCol w:w="5328"/>
+        <w:gridCol w:w="10296"/>
       </w:tblGrid>
       <w:tr>
         <w:tc>
           <w:tcPr>
-            <w:tcW w:type="dxa" w:w="7704"/>
+            <w:tcW w:type="dxa" w:w="10858"/>
+            <w:tcBorders>
+              <w:top w:val="nil"/>
+              <w:left w:val="nil"/>
+              <w:right w:val="nil"/>
+              <w:bottom w:val="single" w:sz="4" w:space="1" w:color="B4B4B4"/>
+            </w:tcBorders>
+          </w:tcPr>
+          <w:p>
+            <w:pPr>
+              <w:spacing w:before="60" w:after="20"/>
+            </w:pPr>
+            <w:r>
+              <w:rPr>
+                <w:rFonts w:ascii="Arial" w:hAnsi="Arial" w:eastAsia="Arial"/>
+                <w:b/>
+                <w:i w:val="0"/>
+                <w:color w:val="202020"/>
+                <w:sz w:val="15"/>
+              </w:rPr>
+              <w:t>WORK EXPERIENCE</w:t>
+            </w:r>
+          </w:p>
+        </w:tc>
+      </w:tr>
+    </w:tbl>
+    <w:tbl>
+      <w:tblPr>
+        <w:tblW w:type="auto" w:w="0"/>
+        <w:tblLayout w:type="fixed"/>
+        <w:tblLook w:firstColumn="1" w:firstRow="1" w:lastColumn="0" w:lastRow="0" w:noHBand="0" w:noVBand="1" w:val="04A0"/>
+      </w:tblPr>
+      <w:tblGrid>
+        <w:gridCol w:w="5429"/>
+        <w:gridCol w:w="5429"/>
+      </w:tblGrid>
+      <w:tr>
+        <w:tc>
+          <w:tcPr>
+            <w:tcW w:type="dxa" w:w="8136"/>
             <w:vAlign w:val="center"/>
             <w:tcBorders>
               <w:top w:val="nil"/>
               <w:left w:val="nil"/>
+              <w:right w:val="nil"/>
               <w:bottom w:val="nil"/>
-              <w:right w:val="nil"/>
             </w:tcBorders>
           </w:tcPr>
           <w:p>
@@ -1415,9 +1585,11 @@
             </w:pPr>
             <w:r>
               <w:rPr>
+                <w:rFonts w:ascii="Arial" w:hAnsi="Arial" w:eastAsia="Arial"/>
                 <w:b/>
                 <w:i w:val="0"/>
-                <w:sz w:val="18"/>
+                <w:color w:val="202020"/>
+                <w:sz w:val="16"/>
               </w:rPr>
               <w:t>CMU Center for Technology Transfer and Enterprise Creation</w:t>
             </w:r>
@@ -1425,13 +1597,13 @@
         </w:tc>
         <w:tc>
           <w:tcPr>
-            <w:tcW w:type="dxa" w:w="2232"/>
+            <w:tcW w:type="dxa" w:w="2160"/>
             <w:vAlign w:val="center"/>
             <w:tcBorders>
               <w:top w:val="nil"/>
               <w:left w:val="nil"/>
+              <w:right w:val="nil"/>
               <w:bottom w:val="nil"/>
-              <w:right w:val="nil"/>
             </w:tcBorders>
           </w:tcPr>
           <w:p>
@@ -1441,9 +1613,11 @@
             </w:pPr>
             <w:r>
               <w:rPr>
-                <w:b/>
+                <w:rFonts w:ascii="Arial" w:hAnsi="Arial" w:eastAsia="Arial"/>
+                <w:b w:val="0"/>
                 <w:i w:val="0"/>
-                <w:sz w:val="18"/>
+                <w:color w:val="202020"/>
+                <w:sz w:val="16"/>
               </w:rPr>
               <w:t>May 2023 - Aug 2023</w:t>
             </w:r>
@@ -1454,80 +1628,71 @@
     <w:p>
       <w:pPr>
         <w:keepNext/>
-        <w:spacing w:after="20"/>
+        <w:spacing w:after="10"/>
       </w:pPr>
       <w:r>
         <w:rPr>
+          <w:rFonts w:ascii="Arial" w:hAnsi="Arial" w:eastAsia="Arial"/>
           <w:b w:val="0"/>
-          <w:i/>
-          <w:color w:val="5D6864"/>
-          <w:sz w:val="17"/>
+          <w:i w:val="0"/>
+          <w:color w:val="5F5F5F"/>
+          <w:sz w:val="15"/>
         </w:rPr>
-        <w:t>Enterprise Creation Intern | Pittsburgh, PA</w:t>
+        <w:t>Enterprise creation intern | Pittsburgh, PA</w:t>
       </w:r>
     </w:p>
     <w:p>
       <w:pPr>
         <w:pStyle w:val="ListBullet"/>
         <w:keepLines/>
-        <w:spacing w:after="12" w:line="240" w:lineRule="auto"/>
-        <w:ind w:left="259" w:hanging="173"/>
+        <w:spacing w:after="8" w:line="240" w:lineRule="auto"/>
+        <w:ind w:left="259" w:hanging="158"/>
       </w:pPr>
       <w:r>
         <w:rPr>
+          <w:rFonts w:ascii="Arial" w:hAnsi="Arial" w:eastAsia="Arial"/>
           <w:b w:val="0"/>
           <w:i w:val="0"/>
-          <w:sz w:val="17"/>
+          <w:color w:val="202020"/>
+          <w:sz w:val="16"/>
         </w:rPr>
-        <w:t>Built profiles for 1,000+ customers, identified 60+ high-potential leads, and connected with 26 key prospects for CMU Bio-robotic Lab market discovery.</w:t>
+        <w:t>Prepared customer profiles and interview notes for CMU Bio-robotic Lab market discovery, including 60+ lead interviews and 26 key prospects.</w:t>
       </w:r>
     </w:p>
     <w:p>
       <w:pPr>
         <w:pStyle w:val="ListBullet"/>
         <w:keepLines/>
-        <w:spacing w:after="12" w:line="240" w:lineRule="auto"/>
-        <w:ind w:left="259" w:hanging="173"/>
+        <w:spacing w:after="8" w:line="240" w:lineRule="auto"/>
+        <w:ind w:left="259" w:hanging="158"/>
       </w:pPr>
       <w:r>
         <w:rPr>
+          <w:rFonts w:ascii="Arial" w:hAnsi="Arial" w:eastAsia="Arial"/>
           <w:b w:val="0"/>
           <w:i w:val="0"/>
-          <w:sz w:val="17"/>
+          <w:color w:val="202020"/>
+          <w:sz w:val="16"/>
         </w:rPr>
-        <w:t>Analyzed one-million-plus data points with RStudio and Excel to evaluate market potential and align technical use cases with commercialization evidence.</w:t>
+        <w:t>Analyzed market and customer data with RStudio and Excel to connect technical use cases with commercialization evidence.</w:t>
       </w:r>
     </w:p>
     <w:p>
       <w:pPr>
         <w:pStyle w:val="ListBullet"/>
         <w:keepLines/>
-        <w:spacing w:after="12" w:line="240" w:lineRule="auto"/>
-        <w:ind w:left="259" w:hanging="173"/>
+        <w:spacing w:after="8" w:line="240" w:lineRule="auto"/>
+        <w:ind w:left="259" w:hanging="158"/>
       </w:pPr>
       <w:r>
         <w:rPr>
+          <w:rFonts w:ascii="Arial" w:hAnsi="Arial" w:eastAsia="Arial"/>
           <w:b w:val="0"/>
           <w:i w:val="0"/>
-          <w:sz w:val="17"/>
+          <w:color w:val="202020"/>
+          <w:sz w:val="16"/>
         </w:rPr>
-        <w:t>Led Phlux consulting work including 20+ customer interviews to refine core use cases and market-entry assumptions.</w:t>
-      </w:r>
-    </w:p>
-    <w:p>
-      <w:pPr>
-        <w:pStyle w:val="ListBullet"/>
-        <w:keepLines/>
-        <w:spacing w:after="12" w:line="240" w:lineRule="auto"/>
-        <w:ind w:left="259" w:hanging="173"/>
-      </w:pPr>
-      <w:r>
-        <w:rPr>
-          <w:b w:val="0"/>
-          <w:i w:val="0"/>
-          <w:sz w:val="17"/>
-        </w:rPr>
-        <w:t>Defined 10+ proprietary technology use cases to support product positioning and comparative market-feedback analysis.</w:t>
+        <w:t>Supported Phlux product-positioning work through customer interviews and technology use-case summaries.</w:t>
       </w:r>
     </w:p>
     <w:tbl>
@@ -1537,19 +1702,19 @@
         <w:tblLook w:firstColumn="1" w:firstRow="1" w:lastColumn="0" w:lastRow="0" w:noHBand="0" w:noVBand="1" w:val="04A0"/>
       </w:tblPr>
       <w:tblGrid>
-        <w:gridCol w:w="5328"/>
-        <w:gridCol w:w="5328"/>
+        <w:gridCol w:w="5429"/>
+        <w:gridCol w:w="5429"/>
       </w:tblGrid>
       <w:tr>
         <w:tc>
           <w:tcPr>
-            <w:tcW w:type="dxa" w:w="7704"/>
+            <w:tcW w:type="dxa" w:w="8136"/>
             <w:vAlign w:val="center"/>
             <w:tcBorders>
               <w:top w:val="nil"/>
               <w:left w:val="nil"/>
+              <w:right w:val="nil"/>
               <w:bottom w:val="nil"/>
-              <w:right w:val="nil"/>
             </w:tcBorders>
           </w:tcPr>
           <w:p>
@@ -1558,9 +1723,11 @@
             </w:pPr>
             <w:r>
               <w:rPr>
+                <w:rFonts w:ascii="Arial" w:hAnsi="Arial" w:eastAsia="Arial"/>
                 <w:b/>
                 <w:i w:val="0"/>
-                <w:sz w:val="18"/>
+                <w:color w:val="202020"/>
+                <w:sz w:val="16"/>
               </w:rPr>
               <w:t>Signify (China) Investment Co., Ltd.</w:t>
             </w:r>
@@ -1568,13 +1735,13 @@
         </w:tc>
         <w:tc>
           <w:tcPr>
-            <w:tcW w:type="dxa" w:w="2232"/>
+            <w:tcW w:type="dxa" w:w="2160"/>
             <w:vAlign w:val="center"/>
             <w:tcBorders>
               <w:top w:val="nil"/>
               <w:left w:val="nil"/>
+              <w:right w:val="nil"/>
               <w:bottom w:val="nil"/>
-              <w:right w:val="nil"/>
             </w:tcBorders>
           </w:tcPr>
           <w:p>
@@ -1584,9 +1751,11 @@
             </w:pPr>
             <w:r>
               <w:rPr>
-                <w:b/>
+                <w:rFonts w:ascii="Arial" w:hAnsi="Arial" w:eastAsia="Arial"/>
+                <w:b w:val="0"/>
                 <w:i w:val="0"/>
-                <w:sz w:val="18"/>
+                <w:color w:val="202020"/>
+                <w:sz w:val="16"/>
               </w:rPr>
               <w:t>Sep 2022 - Dec 2022</w:t>
             </w:r>
@@ -1597,30 +1766,33 @@
     <w:p>
       <w:pPr>
         <w:keepNext/>
-        <w:spacing w:after="20"/>
+        <w:spacing w:after="10"/>
       </w:pPr>
       <w:r>
         <w:rPr>
+          <w:rFonts w:ascii="Arial" w:hAnsi="Arial" w:eastAsia="Arial"/>
           <w:b w:val="0"/>
-          <w:i/>
-          <w:color w:val="5D6864"/>
-          <w:sz w:val="17"/>
+          <w:i w:val="0"/>
+          <w:color w:val="5F5F5F"/>
+          <w:sz w:val="15"/>
         </w:rPr>
-        <w:t>Hardware Engineer Intern | Shanghai, China</w:t>
+        <w:t>Hardware engineer intern | Shanghai, China</w:t>
       </w:r>
     </w:p>
     <w:p>
       <w:pPr>
         <w:pStyle w:val="ListBullet"/>
         <w:keepLines/>
-        <w:spacing w:after="12" w:line="240" w:lineRule="auto"/>
-        <w:ind w:left="259" w:hanging="173"/>
+        <w:spacing w:after="8" w:line="240" w:lineRule="auto"/>
+        <w:ind w:left="259" w:hanging="158"/>
       </w:pPr>
       <w:r>
         <w:rPr>
+          <w:rFonts w:ascii="Arial" w:hAnsi="Arial" w:eastAsia="Arial"/>
           <w:b w:val="0"/>
           <w:i w:val="0"/>
-          <w:sz w:val="17"/>
+          <w:color w:val="202020"/>
+          <w:sz w:val="16"/>
         </w:rPr>
         <w:t>Optimized power-circuit designs with active EMI filters and high-performance capacitors, reducing power consumption by 30%.</w:t>
       </w:r>
@@ -1629,16 +1801,18 @@
       <w:pPr>
         <w:pStyle w:val="ListBullet"/>
         <w:keepLines/>
-        <w:spacing w:after="12" w:line="240" w:lineRule="auto"/>
-        <w:ind w:left="259" w:hanging="173"/>
+        <w:spacing w:after="8" w:line="240" w:lineRule="auto"/>
+        <w:ind w:left="259" w:hanging="158"/>
       </w:pPr>
       <w:r>
         <w:rPr>
+          <w:rFonts w:ascii="Arial" w:hAnsi="Arial" w:eastAsia="Arial"/>
           <w:b w:val="0"/>
           <w:i w:val="0"/>
-          <w:sz w:val="17"/>
+          <w:color w:val="202020"/>
+          <w:sz w:val="16"/>
         </w:rPr>
-        <w:t>Debugged and tested IoT lamp functionality, improving lighting accuracy and user response speed by refining control algorithms and response logic.</w:t>
+        <w:t>Debugged and tested IoT lamp functionality, including lighting accuracy and response-logic issues.</w:t>
       </w:r>
     </w:p>
     <w:tbl>
@@ -1648,19 +1822,19 @@
         <w:tblLook w:firstColumn="1" w:firstRow="1" w:lastColumn="0" w:lastRow="0" w:noHBand="0" w:noVBand="1" w:val="04A0"/>
       </w:tblPr>
       <w:tblGrid>
-        <w:gridCol w:w="5328"/>
-        <w:gridCol w:w="5328"/>
+        <w:gridCol w:w="5429"/>
+        <w:gridCol w:w="5429"/>
       </w:tblGrid>
       <w:tr>
         <w:tc>
           <w:tcPr>
-            <w:tcW w:type="dxa" w:w="7704"/>
+            <w:tcW w:type="dxa" w:w="8136"/>
             <w:vAlign w:val="center"/>
             <w:tcBorders>
               <w:top w:val="nil"/>
               <w:left w:val="nil"/>
+              <w:right w:val="nil"/>
               <w:bottom w:val="nil"/>
-              <w:right w:val="nil"/>
             </w:tcBorders>
           </w:tcPr>
           <w:p>
@@ -1669,9 +1843,11 @@
             </w:pPr>
             <w:r>
               <w:rPr>
+                <w:rFonts w:ascii="Arial" w:hAnsi="Arial" w:eastAsia="Arial"/>
                 <w:b/>
                 <w:i w:val="0"/>
-                <w:sz w:val="18"/>
+                <w:color w:val="202020"/>
+                <w:sz w:val="16"/>
               </w:rPr>
               <w:t>China Mobile Communication Group Co., Ltd.</w:t>
             </w:r>
@@ -1679,13 +1855,13 @@
         </w:tc>
         <w:tc>
           <w:tcPr>
-            <w:tcW w:type="dxa" w:w="2232"/>
+            <w:tcW w:type="dxa" w:w="2160"/>
             <w:vAlign w:val="center"/>
             <w:tcBorders>
               <w:top w:val="nil"/>
               <w:left w:val="nil"/>
+              <w:right w:val="nil"/>
               <w:bottom w:val="nil"/>
-              <w:right w:val="nil"/>
             </w:tcBorders>
           </w:tcPr>
           <w:p>
@@ -1695,9 +1871,11 @@
             </w:pPr>
             <w:r>
               <w:rPr>
-                <w:b/>
+                <w:rFonts w:ascii="Arial" w:hAnsi="Arial" w:eastAsia="Arial"/>
+                <w:b w:val="0"/>
                 <w:i w:val="0"/>
-                <w:sz w:val="18"/>
+                <w:color w:val="202020"/>
+                <w:sz w:val="16"/>
               </w:rPr>
               <w:t>Jul 2020 - Aug 2020</w:t>
             </w:r>
@@ -1708,125 +1886,164 @@
     <w:p>
       <w:pPr>
         <w:keepNext/>
-        <w:spacing w:after="20"/>
+        <w:spacing w:after="10"/>
       </w:pPr>
       <w:r>
         <w:rPr>
+          <w:rFonts w:ascii="Arial" w:hAnsi="Arial" w:eastAsia="Arial"/>
           <w:b w:val="0"/>
-          <w:i/>
-          <w:color w:val="5D6864"/>
-          <w:sz w:val="17"/>
+          <w:i w:val="0"/>
+          <w:color w:val="5F5F5F"/>
+          <w:sz w:val="15"/>
         </w:rPr>
-        <w:t>Engineering Maintenance Intern | Changzhou, China</w:t>
+        <w:t>Engineering maintenance intern | Changzhou, China</w:t>
       </w:r>
     </w:p>
     <w:p>
       <w:pPr>
         <w:pStyle w:val="ListBullet"/>
         <w:keepLines/>
-        <w:spacing w:after="12" w:line="240" w:lineRule="auto"/>
-        <w:ind w:left="259" w:hanging="173"/>
+        <w:spacing w:after="8" w:line="240" w:lineRule="auto"/>
+        <w:ind w:left="259" w:hanging="158"/>
       </w:pPr>
       <w:r>
         <w:rPr>
+          <w:rFonts w:ascii="Arial" w:hAnsi="Arial" w:eastAsia="Arial"/>
           <w:b w:val="0"/>
           <w:i w:val="0"/>
-          <w:sz w:val="17"/>
+          <w:color w:val="202020"/>
+          <w:sz w:val="16"/>
         </w:rPr>
-        <w:t>Supported planning and deployment of 10+ 5G base stations, expanding network coverage in three service areas.</w:t>
+        <w:t>Supported planning and maintenance work for 10+ 5G base stations across three service areas.</w:t>
       </w:r>
     </w:p>
     <w:p>
       <w:pPr>
         <w:pStyle w:val="ListBullet"/>
         <w:keepLines/>
-        <w:spacing w:after="12" w:line="240" w:lineRule="auto"/>
-        <w:ind w:left="259" w:hanging="173"/>
+        <w:spacing w:after="8" w:line="240" w:lineRule="auto"/>
+        <w:ind w:left="259" w:hanging="158"/>
       </w:pPr>
       <w:r>
         <w:rPr>
+          <w:rFonts w:ascii="Arial" w:hAnsi="Arial" w:eastAsia="Arial"/>
           <w:b w:val="0"/>
           <w:i w:val="0"/>
-          <w:sz w:val="17"/>
+          <w:color w:val="202020"/>
+          <w:sz w:val="16"/>
         </w:rPr>
-        <w:t>Resolved base-station issues involving signal interference, transmission delay, and energy efficiency, contributing to reduced network downtime.</w:t>
+        <w:t>Documented field troubleshooting for signal interference, transmission delay, and energy-efficiency issues.</w:t>
       </w:r>
     </w:p>
+    <w:tbl>
+      <w:tblPr>
+        <w:tblW w:type="auto" w:w="0"/>
+        <w:tblLayout w:type="fixed"/>
+        <w:tblLook w:firstColumn="1" w:firstRow="1" w:lastColumn="0" w:lastRow="0" w:noHBand="0" w:noVBand="1" w:val="04A0"/>
+      </w:tblPr>
+      <w:tblGrid>
+        <w:gridCol w:w="10296"/>
+      </w:tblGrid>
+      <w:tr>
+        <w:tc>
+          <w:tcPr>
+            <w:tcW w:type="dxa" w:w="10858"/>
+            <w:tcBorders>
+              <w:top w:val="nil"/>
+              <w:left w:val="nil"/>
+              <w:right w:val="nil"/>
+              <w:bottom w:val="single" w:sz="4" w:space="1" w:color="B4B4B4"/>
+            </w:tcBorders>
+          </w:tcPr>
+          <w:p>
+            <w:pPr>
+              <w:spacing w:before="60" w:after="20"/>
+            </w:pPr>
+            <w:r>
+              <w:rPr>
+                <w:rFonts w:ascii="Arial" w:hAnsi="Arial" w:eastAsia="Arial"/>
+                <w:b/>
+                <w:i w:val="0"/>
+                <w:color w:val="202020"/>
+                <w:sz w:val="15"/>
+              </w:rPr>
+              <w:t>PUBLICATION</w:t>
+            </w:r>
+          </w:p>
+        </w:tc>
+      </w:tr>
+    </w:tbl>
     <w:p>
       <w:pPr>
-        <w:pStyle w:val="ListBullet"/>
-        <w:keepLines/>
-        <w:spacing w:after="12" w:line="240" w:lineRule="auto"/>
-        <w:ind w:left="259" w:hanging="173"/>
+        <w:spacing w:after="10" w:line="240" w:lineRule="auto"/>
       </w:pPr>
       <w:r>
         <w:rPr>
+          <w:rFonts w:ascii="Arial" w:hAnsi="Arial" w:eastAsia="Arial"/>
           <w:b w:val="0"/>
           <w:i w:val="0"/>
-          <w:sz w:val="17"/>
-        </w:rPr>
-        <w:t>Assisted maintenance workflows for malfunctioning base stations and documented field-level troubleshooting outcomes.</w:t>
-      </w:r>
-    </w:p>
-    <w:p>
-      <w:pPr>
-        <w:keepNext/>
-        <w:spacing w:before="120" w:after="40"/>
-      </w:pPr>
-      <w:r>
-        <w:rPr>
-          <w:b/>
-          <w:i w:val="0"/>
-          <w:color w:val="1F4F4C"/>
-          <w:sz w:val="20"/>
-        </w:rPr>
-        <w:t>PUBLICATION</w:t>
-      </w:r>
-    </w:p>
-    <w:p>
-      <w:pPr>
-        <w:spacing w:after="40"/>
-      </w:pPr>
-      <w:r>
-        <w:rPr>
-          <w:b w:val="0"/>
-          <w:i w:val="0"/>
-          <w:sz w:val="17"/>
+          <w:color w:val="202020"/>
+          <w:sz w:val="16"/>
         </w:rPr>
         <w:t>Y. Ni and L. Shi, "Specific clustering scenarios and simple algorithm simulation in 5G environment," Proc. SPIE 12087, EIECT 2021, 120870M, 2021.</w:t>
       </w:r>
     </w:p>
+    <w:tbl>
+      <w:tblPr>
+        <w:tblW w:type="auto" w:w="0"/>
+        <w:tblLayout w:type="fixed"/>
+        <w:tblLook w:firstColumn="1" w:firstRow="1" w:lastColumn="0" w:lastRow="0" w:noHBand="0" w:noVBand="1" w:val="04A0"/>
+      </w:tblPr>
+      <w:tblGrid>
+        <w:gridCol w:w="10296"/>
+      </w:tblGrid>
+      <w:tr>
+        <w:tc>
+          <w:tcPr>
+            <w:tcW w:type="dxa" w:w="10858"/>
+            <w:tcBorders>
+              <w:top w:val="nil"/>
+              <w:left w:val="nil"/>
+              <w:right w:val="nil"/>
+              <w:bottom w:val="single" w:sz="4" w:space="1" w:color="B4B4B4"/>
+            </w:tcBorders>
+          </w:tcPr>
+          <w:p>
+            <w:pPr>
+              <w:spacing w:before="60" w:after="20"/>
+            </w:pPr>
+            <w:r>
+              <w:rPr>
+                <w:rFonts w:ascii="Arial" w:hAnsi="Arial" w:eastAsia="Arial"/>
+                <w:b/>
+                <w:i w:val="0"/>
+                <w:color w:val="202020"/>
+                <w:sz w:val="15"/>
+              </w:rPr>
+              <w:t>TECHNICAL SKILLS</w:t>
+            </w:r>
+          </w:p>
+        </w:tc>
+      </w:tr>
+    </w:tbl>
     <w:p>
       <w:pPr>
-        <w:keepNext/>
-        <w:spacing w:before="120" w:after="40"/>
+        <w:spacing w:after="10" w:line="240" w:lineRule="auto"/>
       </w:pPr>
       <w:r>
         <w:rPr>
-          <w:b/>
-          <w:i w:val="0"/>
-          <w:color w:val="1F4F4C"/>
-          <w:sz w:val="20"/>
-        </w:rPr>
-        <w:t>TECHNICAL SKILLS</w:t>
-      </w:r>
-    </w:p>
-    <w:p>
-      <w:pPr>
-        <w:spacing w:after="0"/>
-      </w:pPr>
-      <w:r>
-        <w:rPr>
+          <w:rFonts w:ascii="Arial" w:hAnsi="Arial" w:eastAsia="Arial"/>
           <w:b w:val="0"/>
           <w:i w:val="0"/>
-          <w:sz w:val="17"/>
+          <w:color w:val="202020"/>
+          <w:sz w:val="16"/>
         </w:rPr>
         <w:t>Python, MATLAB, C/C++, ROS/ROS2, Linux, PCL, OpenCV, PyTorch, NumPy, STK, NS3, LTspice, Altium Designer.</w:t>
       </w:r>
     </w:p>
     <w:sectPr>
       <w:pgSz w:w="12240" w:h="15840"/>
-      <w:pgMar w:top="648" w:right="792" w:bottom="648" w:left="792" w:header="720" w:footer="720" w:gutter="0"/>
+      <w:pgMar w:top="547" w:right="691" w:bottom="518" w:left="691" w:header="720" w:footer="720" w:gutter="0"/>
       <w:cols w:space="720"/>
       <w:docGrid w:linePitch="360"/>
     </w:sectPr>
@@ -2198,11 +2415,11 @@
     <w:qFormat/>
     <w:rsid w:val="00FC693F"/>
     <w:pPr>
-      <w:spacing w:after="20" w:line="240" w:lineRule="auto"/>
+      <w:spacing w:after="10" w:line="240" w:lineRule="auto"/>
     </w:pPr>
     <w:rPr>
       <w:rFonts w:ascii="Arial" w:hAnsi="Arial" w:eastAsia="Arial"/>
-      <w:sz w:val="17"/>
+      <w:sz w:val="16"/>
     </w:rPr>
   </w:style>
   <w:style w:type="paragraph" w:styleId="Header">
@@ -2735,7 +2952,7 @@
     </w:pPr>
     <w:rPr>
       <w:rFonts w:ascii="Arial" w:hAnsi="Arial" w:eastAsia="Arial"/>
-      <w:sz w:val="17"/>
+      <w:sz w:val="16"/>
     </w:rPr>
   </w:style>
   <w:style w:type="paragraph" w:styleId="ListBullet2">

</xml_diff>